<commit_message>
Sync AEP-Media v0.1.0 DOI metadata
</commit_message>
<xml_diff>
--- a/docs/paper/softwarex/final/submission-pack/main/AEP-Media_SoftwareX_Manuscript.docx
+++ b/docs/paper/softwarex/final/submission-pack/main/AEP-Media_SoftwareX_Manuscript.docx
@@ -260,7 +260,16 @@
         </w:numPr>
       </w:pPr>
       <w:r>
-        <w:t xml:space="preserve">Archive: AEP-Media-specific archive DOI pending release archive; action required before final submission</w:t>
+        <w:t xml:space="preserve">Archive:</w:t>
+      </w:r>
+      <w:r>
+        <w:t xml:space="preserve"> </w:t>
+      </w:r>
+      <w:r>
+        <w:rPr>
+          <w:rStyle w:val="VerbatimChar"/>
+        </w:rPr>
+        <w:t xml:space="preserve">10.5281/zenodo.20107097</w:t>
       </w:r>
     </w:p>
     <w:bookmarkEnd w:id="35"/>
@@ -850,7 +859,7 @@
         <w:pStyle w:val="FirstParagraph"/>
       </w:pPr>
       <w:r>
-        <w:t xml:space="preserve">Future work should keep the local profile semantics stable while adding environment-specific evidence appendices: LinuxPTP traces captured on equipped Linux hosts, ffprobe output from PRFT-bearing media, C2PA CLI reports for real signed assets, independent reproduction of the evaluation matrix, and an AEP-Media-specific archived release DOI.</w:t>
+        <w:t xml:space="preserve">Future work should keep the local profile semantics stable while adding environment-specific evidence appendices: LinuxPTP traces captured on equipped Linux hosts, ffprobe output from PRFT-bearing media, C2PA CLI reports for real signed assets, and independent reproduction of the evaluation matrix.</w:t>
       </w:r>
     </w:p>
     <w:bookmarkEnd w:id="42"/>

</xml_diff>

<commit_message>
Polish SoftwareX submission package
</commit_message>
<xml_diff>
--- a/docs/paper/softwarex/final/submission-pack/main/AEP-Media_SoftwareX_Manuscript.docx
+++ b/docs/paper/softwarex/final/submission-pack/main/AEP-Media_SoftwareX_Manuscript.docx
@@ -2,7 +2,7 @@
 <file path=word/document.xml><?xml version="1.0" encoding="utf-8"?>
 <w:document xmlns:w="http://schemas.openxmlformats.org/wordprocessingml/2006/main" xmlns:m="http://schemas.openxmlformats.org/officeDocument/2006/math" xmlns:r="http://schemas.openxmlformats.org/officeDocument/2006/relationships" xmlns:o="urn:schemas-microsoft-com:office:office" xmlns:v="urn:schemas-microsoft-com:vml" xmlns:w10="urn:schemas-microsoft-com:office:word" xmlns:a="http://schemas.openxmlformats.org/drawingml/2006/main" xmlns:pic="http://schemas.openxmlformats.org/drawingml/2006/picture" xmlns:wp="http://schemas.openxmlformats.org/drawingml/2006/wordprocessingDrawing">
   <w:body>
-    <w:bookmarkStart w:id="45" w:name="Xc569c4eb0913b2ae8a7b55d8a4c011a173a2396"/>
+    <w:bookmarkStart w:id="58" w:name="Xc569c4eb0913b2ae8a7b55d8a4c011a173a2396"/>
     <w:p>
       <w:pPr>
         <w:pStyle w:val="Heading1"/>
@@ -26,6 +26,30 @@
       </w:pPr>
       <w:r>
         <w:t xml:space="preserve">Bin Zhang</w:t>
+      </w:r>
+    </w:p>
+    <w:p>
+      <w:pPr>
+        <w:pStyle w:val="BodyText"/>
+      </w:pPr>
+      <w:r>
+        <w:t xml:space="preserve">Independent Researcher</w:t>
+      </w:r>
+    </w:p>
+    <w:p>
+      <w:pPr>
+        <w:pStyle w:val="BodyText"/>
+      </w:pPr>
+      <w:r>
+        <w:t xml:space="preserve">ORCID: 0009-0002-8861-1481</w:t>
+      </w:r>
+    </w:p>
+    <w:p>
+      <w:pPr>
+        <w:pStyle w:val="BodyText"/>
+      </w:pPr>
+      <w:r>
+        <w:t xml:space="preserve">Email: joy7759@gmail.com</w:t>
       </w:r>
     </w:p>
     <w:bookmarkEnd w:id="32"/>
@@ -61,17 +85,540 @@
         <w:pStyle w:val="FirstParagraph"/>
       </w:pPr>
       <w:r>
-        <w:t xml:space="preserve">media evidence; operation accountability; research software; provenance; offline validation; evidence bundle; time trace</w:t>
+        <w:t xml:space="preserve">media evidence; operation accountability; research software; provenance; offline validation; evidence bundle</w:t>
       </w:r>
     </w:p>
     <w:bookmarkEnd w:id="34"/>
-    <w:bookmarkStart w:id="35" w:name="software-availability"/>
+    <w:bookmarkStart w:id="35" w:name="metadata"/>
     <w:p>
       <w:pPr>
         <w:pStyle w:val="Heading2"/>
       </w:pPr>
       <w:r>
-        <w:t xml:space="preserve">Software Availability</w:t>
+        <w:t xml:space="preserve">Metadata</w:t>
+      </w:r>
+    </w:p>
+    <w:tbl>
+      <w:tblPr>
+        <w:tblStyle w:val="Table"/>
+        <w:tblW w:type="pct" w:w="5000"/>
+        <w:tblLayout w:type="fixed"/>
+        <w:tblLook w:firstRow="1" w:lastRow="0" w:firstColumn="0" w:lastColumn="0" w:noHBand="0" w:noVBand="0" w:val="0020"/>
+      </w:tblPr>
+      <w:tblGrid>
+        <w:gridCol w:w="2640"/>
+        <w:gridCol w:w="2640"/>
+        <w:gridCol w:w="2640"/>
+      </w:tblGrid>
+      <w:tr>
+        <w:trPr>
+          <w:tblHeader w:val="on"/>
+        </w:trPr>
+        <w:tc>
+          <w:tcPr/>
+          <w:p>
+            <w:pPr>
+              <w:pStyle w:val="Compact"/>
+            </w:pPr>
+            <w:r>
+              <w:t xml:space="preserve">Nr</w:t>
+            </w:r>
+          </w:p>
+        </w:tc>
+        <w:tc>
+          <w:tcPr/>
+          <w:p>
+            <w:pPr>
+              <w:pStyle w:val="Compact"/>
+            </w:pPr>
+            <w:r>
+              <w:t xml:space="preserve">Code metadata description</w:t>
+            </w:r>
+          </w:p>
+        </w:tc>
+        <w:tc>
+          <w:tcPr/>
+          <w:p>
+            <w:pPr>
+              <w:pStyle w:val="Compact"/>
+            </w:pPr>
+            <w:r>
+              <w:t xml:space="preserve">Metadata</w:t>
+            </w:r>
+          </w:p>
+        </w:tc>
+      </w:tr>
+      <w:tr>
+        <w:tc>
+          <w:tcPr/>
+          <w:p>
+            <w:pPr>
+              <w:pStyle w:val="Compact"/>
+            </w:pPr>
+            <w:r>
+              <w:t xml:space="preserve">C1</w:t>
+            </w:r>
+          </w:p>
+        </w:tc>
+        <w:tc>
+          <w:tcPr/>
+          <w:p>
+            <w:pPr>
+              <w:pStyle w:val="Compact"/>
+            </w:pPr>
+            <w:r>
+              <w:t xml:space="preserve">Current code version</w:t>
+            </w:r>
+          </w:p>
+        </w:tc>
+        <w:tc>
+          <w:tcPr/>
+          <w:p>
+            <w:pPr>
+              <w:pStyle w:val="Compact"/>
+            </w:pPr>
+            <w:r>
+              <w:rPr>
+                <w:rStyle w:val="VerbatimChar"/>
+              </w:rPr>
+              <w:t xml:space="preserve">aep-media-v0.1.0</w:t>
+            </w:r>
+          </w:p>
+        </w:tc>
+      </w:tr>
+      <w:tr>
+        <w:tc>
+          <w:tcPr/>
+          <w:p>
+            <w:pPr>
+              <w:pStyle w:val="Compact"/>
+            </w:pPr>
+            <w:r>
+              <w:t xml:space="preserve">C2</w:t>
+            </w:r>
+          </w:p>
+        </w:tc>
+        <w:tc>
+          <w:tcPr/>
+          <w:p>
+            <w:pPr>
+              <w:pStyle w:val="Compact"/>
+            </w:pPr>
+            <w:r>
+              <w:t xml:space="preserve">Permanent link to code/repository used for this code version</w:t>
+            </w:r>
+          </w:p>
+        </w:tc>
+        <w:tc>
+          <w:tcPr/>
+          <w:p>
+            <w:pPr>
+              <w:pStyle w:val="Compact"/>
+            </w:pPr>
+            <w:r>
+              <w:rPr>
+                <w:rStyle w:val="VerbatimChar"/>
+              </w:rPr>
+              <w:t xml:space="preserve">https://github.com/joy7758/agent-evidence</w:t>
+            </w:r>
+          </w:p>
+        </w:tc>
+      </w:tr>
+      <w:tr>
+        <w:tc>
+          <w:tcPr/>
+          <w:p>
+            <w:pPr>
+              <w:pStyle w:val="Compact"/>
+            </w:pPr>
+            <w:r>
+              <w:t xml:space="preserve">C3</w:t>
+            </w:r>
+          </w:p>
+        </w:tc>
+        <w:tc>
+          <w:tcPr/>
+          <w:p>
+            <w:pPr>
+              <w:pStyle w:val="Compact"/>
+            </w:pPr>
+            <w:r>
+              <w:t xml:space="preserve">Legal code license</w:t>
+            </w:r>
+          </w:p>
+        </w:tc>
+        <w:tc>
+          <w:tcPr/>
+          <w:p>
+            <w:pPr>
+              <w:pStyle w:val="Compact"/>
+            </w:pPr>
+            <w:r>
+              <w:t xml:space="preserve">Apache-2.0</w:t>
+            </w:r>
+          </w:p>
+        </w:tc>
+      </w:tr>
+      <w:tr>
+        <w:tc>
+          <w:tcPr/>
+          <w:p>
+            <w:pPr>
+              <w:pStyle w:val="Compact"/>
+            </w:pPr>
+            <w:r>
+              <w:t xml:space="preserve">C4</w:t>
+            </w:r>
+          </w:p>
+        </w:tc>
+        <w:tc>
+          <w:tcPr/>
+          <w:p>
+            <w:pPr>
+              <w:pStyle w:val="Compact"/>
+            </w:pPr>
+            <w:r>
+              <w:t xml:space="preserve">Code versioning system used</w:t>
+            </w:r>
+          </w:p>
+        </w:tc>
+        <w:tc>
+          <w:tcPr/>
+          <w:p>
+            <w:pPr>
+              <w:pStyle w:val="Compact"/>
+            </w:pPr>
+            <w:r>
+              <w:t xml:space="preserve">git</w:t>
+            </w:r>
+          </w:p>
+        </w:tc>
+      </w:tr>
+      <w:tr>
+        <w:tc>
+          <w:tcPr/>
+          <w:p>
+            <w:pPr>
+              <w:pStyle w:val="Compact"/>
+            </w:pPr>
+            <w:r>
+              <w:t xml:space="preserve">C5</w:t>
+            </w:r>
+          </w:p>
+        </w:tc>
+        <w:tc>
+          <w:tcPr/>
+          <w:p>
+            <w:pPr>
+              <w:pStyle w:val="Compact"/>
+            </w:pPr>
+            <w:r>
+              <w:t xml:space="preserve">Software code languages, tools and services used</w:t>
+            </w:r>
+          </w:p>
+        </w:tc>
+        <w:tc>
+          <w:tcPr/>
+          <w:p>
+            <w:pPr>
+              <w:pStyle w:val="Compact"/>
+            </w:pPr>
+            <w:r>
+              <w:t xml:space="preserve">Python; JSON Schema; pytest; Click CLI; Pandoc/LaTeX only for manuscript packaging</w:t>
+            </w:r>
+          </w:p>
+        </w:tc>
+      </w:tr>
+      <w:tr>
+        <w:tc>
+          <w:tcPr/>
+          <w:p>
+            <w:pPr>
+              <w:pStyle w:val="Compact"/>
+            </w:pPr>
+            <w:r>
+              <w:t xml:space="preserve">C6</w:t>
+            </w:r>
+          </w:p>
+        </w:tc>
+        <w:tc>
+          <w:tcPr/>
+          <w:p>
+            <w:pPr>
+              <w:pStyle w:val="Compact"/>
+            </w:pPr>
+            <w:r>
+              <w:t xml:space="preserve">Compilation requirements, operating environments and dependencies</w:t>
+            </w:r>
+          </w:p>
+        </w:tc>
+        <w:tc>
+          <w:tcPr/>
+          <w:p>
+            <w:pPr>
+              <w:pStyle w:val="Compact"/>
+            </w:pPr>
+            <w:r>
+              <w:t xml:space="preserve">Python 3.11+; install with</w:t>
+            </w:r>
+            <w:r>
+              <w:t xml:space="preserve"> </w:t>
+            </w:r>
+            <w:r>
+              <w:rPr>
+                <w:rStyle w:val="VerbatimChar"/>
+              </w:rPr>
+              <w:t xml:space="preserve">python -m pip install -e .</w:t>
+            </w:r>
+            <w:r>
+              <w:t xml:space="preserve">; optional LinuxPTP, FFmpeg/ffprobe, and C2PA tools are not required for fixture-based validation</w:t>
+            </w:r>
+          </w:p>
+        </w:tc>
+      </w:tr>
+      <w:tr>
+        <w:tc>
+          <w:tcPr/>
+          <w:p>
+            <w:pPr>
+              <w:pStyle w:val="Compact"/>
+            </w:pPr>
+            <w:r>
+              <w:t xml:space="preserve">C7</w:t>
+            </w:r>
+          </w:p>
+        </w:tc>
+        <w:tc>
+          <w:tcPr/>
+          <w:p>
+            <w:pPr>
+              <w:pStyle w:val="Compact"/>
+            </w:pPr>
+            <w:r>
+              <w:t xml:space="preserve">If available, link to developer documentation/manual</w:t>
+            </w:r>
+          </w:p>
+        </w:tc>
+        <w:tc>
+          <w:tcPr/>
+          <w:p>
+            <w:pPr>
+              <w:pStyle w:val="Compact"/>
+            </w:pPr>
+            <w:r>
+              <w:rPr>
+                <w:rStyle w:val="VerbatimChar"/>
+              </w:rPr>
+              <w:t xml:space="preserve">https://github.com/joy7758/agent-evidence</w:t>
+            </w:r>
+            <w:r>
+              <w:t xml:space="preserve">; repository documentation under</w:t>
+            </w:r>
+            <w:r>
+              <w:t xml:space="preserve"> </w:t>
+            </w:r>
+            <w:r>
+              <w:rPr>
+                <w:rStyle w:val="VerbatimChar"/>
+              </w:rPr>
+              <w:t xml:space="preserve">README.md</w:t>
+            </w:r>
+            <w:r>
+              <w:t xml:space="preserve">,</w:t>
+            </w:r>
+            <w:r>
+              <w:t xml:space="preserve"> </w:t>
+            </w:r>
+            <w:r>
+              <w:rPr>
+                <w:rStyle w:val="VerbatimChar"/>
+              </w:rPr>
+              <w:t xml:space="preserve">spec/</w:t>
+            </w:r>
+            <w:r>
+              <w:t xml:space="preserve">,</w:t>
+            </w:r>
+            <w:r>
+              <w:t xml:space="preserve"> </w:t>
+            </w:r>
+            <w:r>
+              <w:rPr>
+                <w:rStyle w:val="VerbatimChar"/>
+              </w:rPr>
+              <w:t xml:space="preserve">schema/</w:t>
+            </w:r>
+            <w:r>
+              <w:t xml:space="preserve">,</w:t>
+            </w:r>
+            <w:r>
+              <w:t xml:space="preserve"> </w:t>
+            </w:r>
+            <w:r>
+              <w:rPr>
+                <w:rStyle w:val="VerbatimChar"/>
+              </w:rPr>
+              <w:t xml:space="preserve">examples/media/</w:t>
+            </w:r>
+            <w:r>
+              <w:t xml:space="preserve">,</w:t>
+            </w:r>
+            <w:r>
+              <w:t xml:space="preserve"> </w:t>
+            </w:r>
+            <w:r>
+              <w:rPr>
+                <w:rStyle w:val="VerbatimChar"/>
+              </w:rPr>
+              <w:t xml:space="preserve">demo/</w:t>
+            </w:r>
+            <w:r>
+              <w:t xml:space="preserve">, and</w:t>
+            </w:r>
+            <w:r>
+              <w:t xml:space="preserve"> </w:t>
+            </w:r>
+            <w:r>
+              <w:rPr>
+                <w:rStyle w:val="VerbatimChar"/>
+              </w:rPr>
+              <w:t xml:space="preserve">docs/reports/</w:t>
+            </w:r>
+          </w:p>
+        </w:tc>
+      </w:tr>
+      <w:tr>
+        <w:tc>
+          <w:tcPr/>
+          <w:p>
+            <w:pPr>
+              <w:pStyle w:val="Compact"/>
+            </w:pPr>
+            <w:r>
+              <w:t xml:space="preserve">C8</w:t>
+            </w:r>
+          </w:p>
+        </w:tc>
+        <w:tc>
+          <w:tcPr/>
+          <w:p>
+            <w:pPr>
+              <w:pStyle w:val="Compact"/>
+            </w:pPr>
+            <w:r>
+              <w:t xml:space="preserve">Support email for questions</w:t>
+            </w:r>
+          </w:p>
+        </w:tc>
+        <w:tc>
+          <w:tcPr/>
+          <w:p>
+            <w:pPr>
+              <w:pStyle w:val="Compact"/>
+            </w:pPr>
+            <w:r>
+              <w:t xml:space="preserve">joy7759@gmail.com</w:t>
+            </w:r>
+          </w:p>
+        </w:tc>
+      </w:tr>
+    </w:tbl>
+    <w:bookmarkEnd w:id="35"/>
+    <w:bookmarkStart w:id="36" w:name="motivation-and-significance"/>
+    <w:p>
+      <w:pPr>
+        <w:pStyle w:val="Heading2"/>
+      </w:pPr>
+      <w:r>
+        <w:t xml:space="preserve">1. Motivation and significance</w:t>
+      </w:r>
+    </w:p>
+    <w:p>
+      <w:pPr>
+        <w:pStyle w:val="FirstParagraph"/>
+      </w:pPr>
+      <w:r>
+        <w:t xml:space="preserve">Researchers working with media-bearing operations often need to review disconnected artifacts: media files, logs, provenance declarations, timing metadata, policy references, and validation reports. These objects are difficult to inspect consistently when they are not bound into a local evidence object with explicit validation semantics. AEP-Media addresses this gap by providing a reusable software layer for turning such materials into locally checkable evidence bundles with machine-readable failure codes.</w:t>
+      </w:r>
+    </w:p>
+    <w:p>
+      <w:pPr>
+        <w:pStyle w:val="BodyText"/>
+      </w:pPr>
+      <w:r>
+        <w:t xml:space="preserve">The problem is deliberately bounded. AEP-Media is not a legal evidence platform and does not attempt to prove external authenticity. Its purpose is to make the local validation boundary explicit: which fields must be present, which references must close, which files must match declared hashes, which time traces cover a declared window, and which failures are reported when a controlled rule is broken. This local conformance layer is useful before stronger external assurance mechanisms such as signing, trusted timestamping, or deployed capture pipelines are added.</w:t>
+      </w:r>
+    </w:p>
+    <w:p>
+      <w:pPr>
+        <w:pStyle w:val="BodyText"/>
+      </w:pPr>
+      <w:r>
+        <w:t xml:space="preserve">AEP-Media is positioned next to provenance, media-authenticity, timing, and artifact-review surfaces rather than as a replacement for them. W3C PROV provides general provenance concepts [1,2]. C2PA focuses on content provenance and manifest-based authenticity [3]. FFmpeg/ffprobe and LinuxPTP expose media timing and clock-synchronization surfaces [4,5], while GStreamer provides a PTP clock interface for media pipelines [6]. JSON Schema supports structured validation [7], and artifact-review practices emphasize inspectable and reproducible software packages [8]. AEP-Media contributes a concrete local validation boundary that binds media artifacts, declared provenance, declared time traces, bundle integrity, and failure codes into one reusable research software artifact.</w:t>
+      </w:r>
+    </w:p>
+    <w:bookmarkEnd w:id="36"/>
+    <w:bookmarkStart w:id="37" w:name="software-description"/>
+    <w:p>
+      <w:pPr>
+        <w:pStyle w:val="Heading2"/>
+      </w:pPr>
+      <w:r>
+        <w:t xml:space="preserve">2. Software description</w:t>
+      </w:r>
+    </w:p>
+    <w:p>
+      <w:pPr>
+        <w:pStyle w:val="FirstParagraph"/>
+      </w:pPr>
+      <w:r>
+        <w:t xml:space="preserve">AEP-Media extends the</w:t>
+      </w:r>
+      <w:r>
+        <w:t xml:space="preserve"> </w:t>
+      </w:r>
+      <w:r>
+        <w:rPr>
+          <w:rStyle w:val="VerbatimChar"/>
+        </w:rPr>
+        <w:t xml:space="preserve">agent-evidence</w:t>
+      </w:r>
+      <w:r>
+        <w:t xml:space="preserve"> </w:t>
+      </w:r>
+      <w:r>
+        <w:t xml:space="preserve">package with a media-focused profile and validation path. A media evidence statement binds an actor, subject, operation, policy, constraints, time context, media artifacts, provenance references, evidence notes, and validation expectations into one object. The profile validator checks that the statement is structurally complete and locally consistent.</w:t>
+      </w:r>
+    </w:p>
+    <w:p>
+      <w:pPr>
+        <w:pStyle w:val="BodyText"/>
+      </w:pPr>
+      <w:r>
+        <w:t xml:space="preserve">The offline bundle layer packages a statement and its artifacts into a portable directory. The builder copies artifacts, rewrites paths to bundle-local locations, recomputes hashes and sizes, writes checksums, and emits validation reports. The verifier rejects unsafe paths, missing artifacts, checksum mismatches, and media profile failures. This allows review without relying on the original runtime layout.</w:t>
+      </w:r>
+    </w:p>
+    <w:p>
+      <w:pPr>
+        <w:pStyle w:val="BodyText"/>
+      </w:pPr>
+      <w:r>
+        <w:t xml:space="preserve">The strict-time layer validates declared clock-trace artifacts. It checks trace references, artifact roles, trace hashes, trace profile identity, collection window coverage, sample validity, summary recomputation, offset thresholds, jitter thresholds, and media binding to the declared time context.</w:t>
+      </w:r>
+    </w:p>
+    <w:p>
+      <w:pPr>
+        <w:pStyle w:val="BodyText"/>
+      </w:pPr>
+      <w:r>
+        <w:t xml:space="preserve">The adapter layer is ingestion-only. LinuxPTP-style logs, FFmpeg PRFT-style timing metadata, and C2PA-like manifest metadata can be normalized into AEP-Media reports. Adapter reports distinguish fixture ingestion from optional external-tool reporting and do not imply external verification unless a future environment-specific run records it. This boundary is important because real clock discipline, PRFT extraction, and C2PA signature verification depend on external tools and environment-specific evidence.</w:t>
+      </w:r>
+    </w:p>
+    <w:p>
+      <w:pPr>
+        <w:pStyle w:val="BodyText"/>
+      </w:pPr>
+      <w:r>
+        <w:t xml:space="preserve">The main modules are:</w:t>
       </w:r>
     </w:p>
     <w:p>
@@ -83,16 +630,13 @@
         </w:numPr>
       </w:pPr>
       <w:r>
-        <w:t xml:space="preserve">Software name: AEP-Media, within</w:t>
-      </w:r>
-      <w:r>
-        <w:t xml:space="preserve"> </w:t>
-      </w:r>
-      <w:r>
         <w:rPr>
           <w:rStyle w:val="VerbatimChar"/>
         </w:rPr>
-        <w:t xml:space="preserve">agent-evidence</w:t>
+        <w:t xml:space="preserve">agent_evidence/media_profile.py</w:t>
+      </w:r>
+      <w:r>
+        <w:t xml:space="preserve">: media profile validation.</w:t>
       </w:r>
     </w:p>
     <w:p>
@@ -104,16 +648,13 @@
         </w:numPr>
       </w:pPr>
       <w:r>
-        <w:t xml:space="preserve">Repository:</w:t>
-      </w:r>
-      <w:r>
-        <w:t xml:space="preserve"> </w:t>
-      </w:r>
-      <w:r>
         <w:rPr>
           <w:rStyle w:val="VerbatimChar"/>
         </w:rPr>
-        <w:t xml:space="preserve">https://github.com/joy7758/agent-evidence</w:t>
+        <w:t xml:space="preserve">agent_evidence/media_bundle.py</w:t>
+      </w:r>
+      <w:r>
+        <w:t xml:space="preserve">: offline bundle build and verification.</w:t>
       </w:r>
     </w:p>
     <w:p>
@@ -125,7 +666,13 @@
         </w:numPr>
       </w:pPr>
       <w:r>
-        <w:t xml:space="preserve">License: Apache-2.0</w:t>
+        <w:rPr>
+          <w:rStyle w:val="VerbatimChar"/>
+        </w:rPr>
+        <w:t xml:space="preserve">agent_evidence/media_time.py</w:t>
+      </w:r>
+      <w:r>
+        <w:t xml:space="preserve">: strict declared time-trace validation.</w:t>
       </w:r>
     </w:p>
     <w:p>
@@ -137,16 +684,13 @@
         </w:numPr>
       </w:pPr>
       <w:r>
-        <w:t xml:space="preserve">Primary package:</w:t>
-      </w:r>
-      <w:r>
-        <w:t xml:space="preserve"> </w:t>
-      </w:r>
-      <w:r>
         <w:rPr>
           <w:rStyle w:val="VerbatimChar"/>
         </w:rPr>
-        <w:t xml:space="preserve">agent_evidence</w:t>
+        <w:t xml:space="preserve">agent_evidence/adapters/linuxptp.py</w:t>
+      </w:r>
+      <w:r>
+        <w:t xml:space="preserve">: LinuxPTP-style trace ingestion.</w:t>
       </w:r>
     </w:p>
     <w:p>
@@ -158,7 +702,13 @@
         </w:numPr>
       </w:pPr>
       <w:r>
-        <w:t xml:space="preserve">Programming language: Python</w:t>
+        <w:rPr>
+          <w:rStyle w:val="VerbatimChar"/>
+        </w:rPr>
+        <w:t xml:space="preserve">agent_evidence/adapters/ffmpeg_prft.py</w:t>
+      </w:r>
+      <w:r>
+        <w:t xml:space="preserve">: FFmpeg PRFT-style metadata ingestion.</w:t>
       </w:r>
     </w:p>
     <w:p>
@@ -170,64 +720,13 @@
         </w:numPr>
       </w:pPr>
       <w:r>
-        <w:t xml:space="preserve">Documentation:</w:t>
-      </w:r>
-      <w:r>
-        <w:t xml:space="preserve"> </w:t>
-      </w:r>
-      <w:r>
         <w:rPr>
           <w:rStyle w:val="VerbatimChar"/>
         </w:rPr>
-        <w:t xml:space="preserve">spec/</w:t>
-      </w:r>
-      <w:r>
-        <w:t xml:space="preserve">,</w:t>
-      </w:r>
-      <w:r>
-        <w:t xml:space="preserve"> </w:t>
-      </w:r>
-      <w:r>
-        <w:rPr>
-          <w:rStyle w:val="VerbatimChar"/>
-        </w:rPr>
-        <w:t xml:space="preserve">schema/</w:t>
-      </w:r>
-      <w:r>
-        <w:t xml:space="preserve">,</w:t>
-      </w:r>
-      <w:r>
-        <w:t xml:space="preserve"> </w:t>
-      </w:r>
-      <w:r>
-        <w:rPr>
-          <w:rStyle w:val="VerbatimChar"/>
-        </w:rPr>
-        <w:t xml:space="preserve">examples/media/</w:t>
-      </w:r>
-      <w:r>
-        <w:t xml:space="preserve">,</w:t>
-      </w:r>
-      <w:r>
-        <w:t xml:space="preserve"> </w:t>
-      </w:r>
-      <w:r>
-        <w:rPr>
-          <w:rStyle w:val="VerbatimChar"/>
-        </w:rPr>
-        <w:t xml:space="preserve">demo/</w:t>
-      </w:r>
-      <w:r>
-        <w:t xml:space="preserve">, and</w:t>
-      </w:r>
-      <w:r>
-        <w:t xml:space="preserve"> </w:t>
-      </w:r>
-      <w:r>
-        <w:rPr>
-          <w:rStyle w:val="VerbatimChar"/>
-        </w:rPr>
-        <w:t xml:space="preserve">docs/reports/</w:t>
+        <w:t xml:space="preserve">agent_evidence/adapters/c2pa_manifest.py</w:t>
+      </w:r>
+      <w:r>
+        <w:t xml:space="preserve">: C2PA-like manifest ingestion.</w:t>
       </w:r>
     </w:p>
     <w:p>
@@ -239,16 +738,13 @@
         </w:numPr>
       </w:pPr>
       <w:r>
-        <w:t xml:space="preserve">Tests: media profile, bundle, strict-time, adapter, evaluation, and release-pack tests under</w:t>
-      </w:r>
-      <w:r>
-        <w:t xml:space="preserve"> </w:t>
-      </w:r>
-      <w:r>
         <w:rPr>
           <w:rStyle w:val="VerbatimChar"/>
         </w:rPr>
-        <w:t xml:space="preserve">tests/</w:t>
+        <w:t xml:space="preserve">agent_evidence/media_evaluation.py</w:t>
+      </w:r>
+      <w:r>
+        <w:t xml:space="preserve">: default evaluation matrix.</w:t>
       </w:r>
     </w:p>
     <w:p>
@@ -260,261 +756,13 @@
         </w:numPr>
       </w:pPr>
       <w:r>
-        <w:t xml:space="preserve">Archive:</w:t>
-      </w:r>
-      <w:r>
-        <w:t xml:space="preserve"> </w:t>
-      </w:r>
-      <w:r>
-        <w:rPr>
-          <w:rStyle w:val="VerbatimChar"/>
-        </w:rPr>
-        <w:t xml:space="preserve">10.5281/zenodo.20107097</w:t>
-      </w:r>
-    </w:p>
-    <w:bookmarkEnd w:id="35"/>
-    <w:bookmarkStart w:id="36" w:name="statement-of-need"/>
-    <w:p>
-      <w:pPr>
-        <w:pStyle w:val="Heading2"/>
-      </w:pPr>
-      <w:r>
-        <w:t xml:space="preserve">Statement of Need</w:t>
-      </w:r>
-    </w:p>
-    <w:p>
-      <w:pPr>
-        <w:pStyle w:val="FirstParagraph"/>
-      </w:pPr>
-      <w:r>
-        <w:t xml:space="preserve">Researchers working with media-bearing operations often need to review several disconnected artifacts: media files, logs, provenance declarations, timing metadata, policy references, and validation reports. These objects are difficult to inspect consistently when they are not bound into a local evidence object with explicit validation semantics. AEP-Media addresses this gap by providing a reusable software layer for turning such materials into locally checkable evidence bundles with machine-readable failure codes.</w:t>
-      </w:r>
-    </w:p>
-    <w:p>
-      <w:pPr>
-        <w:pStyle w:val="BodyText"/>
-      </w:pPr>
-      <w:r>
-        <w:t xml:space="preserve">The problem is deliberately bounded. AEP-Media is not a legal evidence platform and does not attempt to prove external authenticity. Its purpose is to make the local validation boundary explicit: which fields must be present, which references must close, which files must match declared hashes, which time traces cover a declared window, and which failures are reported when a controlled rule is broken. This local conformance layer is useful before stronger external assurance mechanisms such as signing, trusted timestamping, or deployed capture pipelines are added.</w:t>
-      </w:r>
-    </w:p>
-    <w:bookmarkEnd w:id="36"/>
-    <w:bookmarkStart w:id="37" w:name="software-description"/>
-    <w:p>
-      <w:pPr>
-        <w:pStyle w:val="Heading2"/>
-      </w:pPr>
-      <w:r>
-        <w:t xml:space="preserve">Software Description</w:t>
-      </w:r>
-    </w:p>
-    <w:p>
-      <w:pPr>
-        <w:pStyle w:val="FirstParagraph"/>
-      </w:pPr>
-      <w:r>
-        <w:t xml:space="preserve">AEP-Media extends the</w:t>
-      </w:r>
-      <w:r>
-        <w:t xml:space="preserve"> </w:t>
-      </w:r>
-      <w:r>
-        <w:rPr>
-          <w:rStyle w:val="VerbatimChar"/>
-        </w:rPr>
-        <w:t xml:space="preserve">agent-evidence</w:t>
-      </w:r>
-      <w:r>
-        <w:t xml:space="preserve"> </w:t>
-      </w:r>
-      <w:r>
-        <w:t xml:space="preserve">package with a media-focused profile and validation path. A media evidence statement binds an actor, subject, operation, policy, constraints, time context, media artifacts, provenance references, evidence notes, and validation expectations into one object. The profile validator checks that the statement is structurally complete and locally consistent.</w:t>
-      </w:r>
-    </w:p>
-    <w:p>
-      <w:pPr>
-        <w:pStyle w:val="BodyText"/>
-      </w:pPr>
-      <w:r>
-        <w:t xml:space="preserve">The offline bundle layer packages a statement and its artifacts into a portable directory. The builder copies artifacts, rewrites paths to bundle-local locations, recomputes hashes and sizes, writes checksums, and emits validation reports. The verifier rejects unsafe paths, missing artifacts, checksum mismatches, and media profile failures. This allows review without relying on the original runtime layout.</w:t>
-      </w:r>
-    </w:p>
-    <w:p>
-      <w:pPr>
-        <w:pStyle w:val="BodyText"/>
-      </w:pPr>
-      <w:r>
-        <w:t xml:space="preserve">The strict-time layer validates declared clock-trace artifacts. It checks trace references, artifact roles, trace hashes, trace profile identity, collection window coverage, sample validity, summary recomputation, offset thresholds, jitter thresholds, and media binding to the declared time context.</w:t>
-      </w:r>
-    </w:p>
-    <w:p>
-      <w:pPr>
-        <w:pStyle w:val="BodyText"/>
-      </w:pPr>
-      <w:r>
-        <w:t xml:space="preserve">The adapter layer is ingestion-only. LinuxPTP-style logs, FFmpeg PRFT-style timing metadata, and C2PA-like manifest metadata can be normalized into AEP-Media reports. Adapter reports distinguish fixture ingestion from optional external-tool reporting and do not imply external verification unless a future environment-specific run records it.</w:t>
-      </w:r>
-    </w:p>
-    <w:bookmarkEnd w:id="37"/>
-    <w:bookmarkStart w:id="38" w:name="architecture-and-functionality"/>
-    <w:p>
-      <w:pPr>
-        <w:pStyle w:val="Heading2"/>
-      </w:pPr>
-      <w:r>
-        <w:t xml:space="preserve">Architecture and Functionality</w:t>
-      </w:r>
-    </w:p>
-    <w:p>
-      <w:pPr>
-        <w:pStyle w:val="FirstParagraph"/>
-      </w:pPr>
-      <w:r>
-        <w:t xml:space="preserve">The main modules are:</w:t>
-      </w:r>
-    </w:p>
-    <w:p>
-      <w:pPr>
-        <w:pStyle w:val="Compact"/>
-        <w:numPr>
-          <w:ilvl w:val="0"/>
-          <w:numId w:val="1002"/>
-        </w:numPr>
-      </w:pPr>
-      <w:r>
-        <w:rPr>
-          <w:rStyle w:val="VerbatimChar"/>
-        </w:rPr>
-        <w:t xml:space="preserve">agent_evidence/media_profile.py</w:t>
-      </w:r>
-      <w:r>
-        <w:t xml:space="preserve">: media profile validation</w:t>
-      </w:r>
-    </w:p>
-    <w:p>
-      <w:pPr>
-        <w:pStyle w:val="Compact"/>
-        <w:numPr>
-          <w:ilvl w:val="0"/>
-          <w:numId w:val="1002"/>
-        </w:numPr>
-      </w:pPr>
-      <w:r>
-        <w:rPr>
-          <w:rStyle w:val="VerbatimChar"/>
-        </w:rPr>
-        <w:t xml:space="preserve">agent_evidence/media_bundle.py</w:t>
-      </w:r>
-      <w:r>
-        <w:t xml:space="preserve">: offline bundle build and verification</w:t>
-      </w:r>
-    </w:p>
-    <w:p>
-      <w:pPr>
-        <w:pStyle w:val="Compact"/>
-        <w:numPr>
-          <w:ilvl w:val="0"/>
-          <w:numId w:val="1002"/>
-        </w:numPr>
-      </w:pPr>
-      <w:r>
-        <w:rPr>
-          <w:rStyle w:val="VerbatimChar"/>
-        </w:rPr>
-        <w:t xml:space="preserve">agent_evidence/media_time.py</w:t>
-      </w:r>
-      <w:r>
-        <w:t xml:space="preserve">: strict declared time-trace validation</w:t>
-      </w:r>
-    </w:p>
-    <w:p>
-      <w:pPr>
-        <w:pStyle w:val="Compact"/>
-        <w:numPr>
-          <w:ilvl w:val="0"/>
-          <w:numId w:val="1002"/>
-        </w:numPr>
-      </w:pPr>
-      <w:r>
-        <w:rPr>
-          <w:rStyle w:val="VerbatimChar"/>
-        </w:rPr>
-        <w:t xml:space="preserve">agent_evidence/adapters/linuxptp.py</w:t>
-      </w:r>
-      <w:r>
-        <w:t xml:space="preserve">: LinuxPTP-style trace ingestion</w:t>
-      </w:r>
-    </w:p>
-    <w:p>
-      <w:pPr>
-        <w:pStyle w:val="Compact"/>
-        <w:numPr>
-          <w:ilvl w:val="0"/>
-          <w:numId w:val="1002"/>
-        </w:numPr>
-      </w:pPr>
-      <w:r>
-        <w:rPr>
-          <w:rStyle w:val="VerbatimChar"/>
-        </w:rPr>
-        <w:t xml:space="preserve">agent_evidence/adapters/ffmpeg_prft.py</w:t>
-      </w:r>
-      <w:r>
-        <w:t xml:space="preserve">: FFmpeg PRFT-style metadata ingestion</w:t>
-      </w:r>
-    </w:p>
-    <w:p>
-      <w:pPr>
-        <w:pStyle w:val="Compact"/>
-        <w:numPr>
-          <w:ilvl w:val="0"/>
-          <w:numId w:val="1002"/>
-        </w:numPr>
-      </w:pPr>
-      <w:r>
-        <w:rPr>
-          <w:rStyle w:val="VerbatimChar"/>
-        </w:rPr>
-        <w:t xml:space="preserve">agent_evidence/adapters/c2pa_manifest.py</w:t>
-      </w:r>
-      <w:r>
-        <w:t xml:space="preserve">: C2PA-like manifest ingestion</w:t>
-      </w:r>
-    </w:p>
-    <w:p>
-      <w:pPr>
-        <w:pStyle w:val="Compact"/>
-        <w:numPr>
-          <w:ilvl w:val="0"/>
-          <w:numId w:val="1002"/>
-        </w:numPr>
-      </w:pPr>
-      <w:r>
-        <w:rPr>
-          <w:rStyle w:val="VerbatimChar"/>
-        </w:rPr>
-        <w:t xml:space="preserve">agent_evidence/media_evaluation.py</w:t>
-      </w:r>
-      <w:r>
-        <w:t xml:space="preserve">: default evaluation matrix</w:t>
-      </w:r>
-    </w:p>
-    <w:p>
-      <w:pPr>
-        <w:pStyle w:val="Compact"/>
-        <w:numPr>
-          <w:ilvl w:val="0"/>
-          <w:numId w:val="1002"/>
-        </w:numPr>
-      </w:pPr>
-      <w:r>
         <w:rPr>
           <w:rStyle w:val="VerbatimChar"/>
         </w:rPr>
         <w:t xml:space="preserve">agent_evidence/media_adapter_evaluation.py</w:t>
       </w:r>
       <w:r>
-        <w:t xml:space="preserve">: adapter-inclusive evaluation</w:t>
+        <w:t xml:space="preserve">: adapter-inclusive evaluation.</w:t>
       </w:r>
     </w:p>
     <w:p>
@@ -522,7 +770,7 @@
         <w:pStyle w:val="Compact"/>
         <w:numPr>
           <w:ilvl w:val="0"/>
-          <w:numId w:val="1002"/>
+          <w:numId w:val="1001"/>
         </w:numPr>
       </w:pPr>
       <w:r>
@@ -532,7 +780,7 @@
         <w:t xml:space="preserve">agent_evidence/media_optional_tools.py</w:t>
       </w:r>
       <w:r>
-        <w:t xml:space="preserve">: optional external-tool reporting</w:t>
+        <w:t xml:space="preserve">: optional external-tool reporting.</w:t>
       </w:r>
     </w:p>
     <w:p>
@@ -540,7 +788,7 @@
         <w:pStyle w:val="Compact"/>
         <w:numPr>
           <w:ilvl w:val="0"/>
-          <w:numId w:val="1002"/>
+          <w:numId w:val="1001"/>
         </w:numPr>
       </w:pPr>
       <w:r>
@@ -550,7 +798,17 @@
         <w:t xml:space="preserve">agent_evidence/media_release_pack.py</w:t>
       </w:r>
       <w:r>
-        <w:t xml:space="preserve">: release pack assembly</w:t>
+        <w:t xml:space="preserve">: release pack assembly.</w:t>
+      </w:r>
+    </w:p>
+    <w:bookmarkEnd w:id="37"/>
+    <w:bookmarkStart w:id="38" w:name="illustrative-examples"/>
+    <w:p>
+      <w:pPr>
+        <w:pStyle w:val="Heading2"/>
+      </w:pPr>
+      <w:r>
+        <w:t xml:space="preserve">3. Illustrative examples</w:t>
       </w:r>
     </w:p>
     <w:p>
@@ -558,7 +816,7 @@
         <w:pStyle w:val="FirstParagraph"/>
       </w:pPr>
       <w:r>
-        <w:t xml:space="preserve">Typical commands are:</w:t>
+        <w:t xml:space="preserve">A typical profile validation run is:</w:t>
       </w:r>
     </w:p>
     <w:p>
@@ -575,11 +833,36 @@
         <w:rPr>
           <w:rStyle w:val="NormalTok"/>
         </w:rPr>
-        <w:t xml:space="preserve"> validate-media-profile examples/media/minimal-valid-media-evidence.json</w:t>
+        <w:t xml:space="preserve"> validate-media-profile </w:t>
+      </w:r>
+      <w:r>
+        <w:rPr>
+          <w:rStyle w:val="DataTypeTok"/>
+        </w:rPr>
+        <w:t xml:space="preserve">\</w:t>
       </w:r>
       <w:r>
         <w:br/>
       </w:r>
+      <w:r>
+        <w:rPr>
+          <w:rStyle w:val="NormalTok"/>
+        </w:rPr>
+        <w:t xml:space="preserve">  examples/media/minimal-valid-media-evidence.json</w:t>
+      </w:r>
+    </w:p>
+    <w:p>
+      <w:pPr>
+        <w:pStyle w:val="FirstParagraph"/>
+      </w:pPr>
+      <w:r>
+        <w:t xml:space="preserve">A minimal offline bundle workflow is:</w:t>
+      </w:r>
+    </w:p>
+    <w:p>
+      <w:pPr>
+        <w:pStyle w:val="SourceCode"/>
+      </w:pPr>
       <w:r>
         <w:rPr>
           <w:rStyle w:val="ExtensionTok"/>
@@ -590,7 +873,37 @@
         <w:rPr>
           <w:rStyle w:val="NormalTok"/>
         </w:rPr>
-        <w:t xml:space="preserve"> build-media-bundle examples/media/minimal-valid-media-evidence.json </w:t>
+        <w:t xml:space="preserve"> build-media-bundle </w:t>
+      </w:r>
+      <w:r>
+        <w:rPr>
+          <w:rStyle w:val="DataTypeTok"/>
+        </w:rPr>
+        <w:t xml:space="preserve">\</w:t>
+      </w:r>
+      <w:r>
+        <w:br/>
+      </w:r>
+      <w:r>
+        <w:rPr>
+          <w:rStyle w:val="NormalTok"/>
+        </w:rPr>
+        <w:t xml:space="preserve">  examples/media/minimal-valid-media-evidence.json </w:t>
+      </w:r>
+      <w:r>
+        <w:rPr>
+          <w:rStyle w:val="DataTypeTok"/>
+        </w:rPr>
+        <w:t xml:space="preserve">\</w:t>
+      </w:r>
+      <w:r>
+        <w:br/>
+      </w:r>
+      <w:r>
+        <w:rPr>
+          <w:rStyle w:val="NormalTok"/>
+        </w:rPr>
+        <w:t xml:space="preserve">  </w:t>
       </w:r>
       <w:r>
         <w:rPr>
@@ -608,6 +921,9 @@
         <w:br/>
       </w:r>
       <w:r>
+        <w:br/>
+      </w:r>
+      <w:r>
         <w:rPr>
           <w:rStyle w:val="ExtensionTok"/>
         </w:rPr>
@@ -617,11 +933,36 @@
         <w:rPr>
           <w:rStyle w:val="NormalTok"/>
         </w:rPr>
-        <w:t xml:space="preserve"> verify-media-bundle /tmp/aep-media-bundle-check</w:t>
+        <w:t xml:space="preserve"> verify-media-bundle </w:t>
+      </w:r>
+      <w:r>
+        <w:rPr>
+          <w:rStyle w:val="DataTypeTok"/>
+        </w:rPr>
+        <w:t xml:space="preserve">\</w:t>
       </w:r>
       <w:r>
         <w:br/>
       </w:r>
+      <w:r>
+        <w:rPr>
+          <w:rStyle w:val="NormalTok"/>
+        </w:rPr>
+        <w:t xml:space="preserve">  /tmp/aep-media-bundle-check</w:t>
+      </w:r>
+    </w:p>
+    <w:p>
+      <w:pPr>
+        <w:pStyle w:val="FirstParagraph"/>
+      </w:pPr>
+      <w:r>
+        <w:t xml:space="preserve">A strict-time validation run is:</w:t>
+      </w:r>
+    </w:p>
+    <w:p>
+      <w:pPr>
+        <w:pStyle w:val="SourceCode"/>
+      </w:pPr>
       <w:r>
         <w:rPr>
           <w:rStyle w:val="ExtensionTok"/>
@@ -632,11 +973,36 @@
         <w:rPr>
           <w:rStyle w:val="NormalTok"/>
         </w:rPr>
-        <w:t xml:space="preserve"> validate-media-time-profile examples/media/time/minimal-valid-time-aware-media-evidence.json</w:t>
+        <w:t xml:space="preserve"> validate-media-time-profile </w:t>
+      </w:r>
+      <w:r>
+        <w:rPr>
+          <w:rStyle w:val="DataTypeTok"/>
+        </w:rPr>
+        <w:t xml:space="preserve">\</w:t>
       </w:r>
       <w:r>
         <w:br/>
       </w:r>
+      <w:r>
+        <w:rPr>
+          <w:rStyle w:val="NormalTok"/>
+        </w:rPr>
+        <w:t xml:space="preserve">  examples/media/time/minimal-valid-time-aware-media-evidence.json</w:t>
+      </w:r>
+    </w:p>
+    <w:p>
+      <w:pPr>
+        <w:pStyle w:val="FirstParagraph"/>
+      </w:pPr>
+      <w:r>
+        <w:t xml:space="preserve">The evaluation matrix can be reproduced with:</w:t>
+      </w:r>
+    </w:p>
+    <w:p>
+      <w:pPr>
+        <w:pStyle w:val="SourceCode"/>
+      </w:pPr>
       <w:r>
         <w:rPr>
           <w:rStyle w:val="ExtensionTok"/>
@@ -651,6 +1017,21 @@
       </w:r>
       <w:r>
         <w:rPr>
+          <w:rStyle w:val="DataTypeTok"/>
+        </w:rPr>
+        <w:t xml:space="preserve">\</w:t>
+      </w:r>
+      <w:r>
+        <w:br/>
+      </w:r>
+      <w:r>
+        <w:rPr>
+          <w:rStyle w:val="NormalTok"/>
+        </w:rPr>
+        <w:t xml:space="preserve">  </w:t>
+      </w:r>
+      <w:r>
+        <w:rPr>
           <w:rStyle w:val="AttributeTok"/>
         </w:rPr>
         <w:t xml:space="preserve">--out</w:t>
@@ -659,7 +1040,7 @@
         <w:rPr>
           <w:rStyle w:val="NormalTok"/>
         </w:rPr>
-        <w:t xml:space="preserve"> demo/output/media_evaluation_demo</w:t>
+        <w:t xml:space="preserve"> /tmp/aep-media-evaluation</w:t>
       </w:r>
     </w:p>
     <w:p>
@@ -667,17 +1048,32 @@
         <w:pStyle w:val="FirstParagraph"/>
       </w:pPr>
       <w:r>
-        <w:t xml:space="preserve">The repository includes valid examples, controlled invalid examples, strict-time fixtures, adapter fixtures, and tamper cases. These allow researchers to reproduce the intended pass/fail behavior without installing LinuxPTP, FFmpeg, ffprobe, or C2PA.</w:t>
+        <w:t xml:space="preserve">The repository includes valid examples, controlled invalid examples, strict-time fixtures, adapter fixtures, and tamper cases. These allow researchers to reproduce the intended pass/fail behavior without installing LinuxPTP, FFmpeg, ffprobe, or C2PA. The archived software release is available from Zenodo as version</w:t>
+      </w:r>
+      <w:r>
+        <w:t xml:space="preserve"> </w:t>
+      </w:r>
+      <w:r>
+        <w:rPr>
+          <w:rStyle w:val="VerbatimChar"/>
+        </w:rPr>
+        <w:t xml:space="preserve">aep-media-v0.1.0</w:t>
+      </w:r>
+      <w:r>
+        <w:t xml:space="preserve"> </w:t>
+      </w:r>
+      <w:r>
+        <w:t xml:space="preserve">[9].</w:t>
       </w:r>
     </w:p>
     <w:bookmarkEnd w:id="38"/>
-    <w:bookmarkStart w:id="39" w:name="reproducibility-and-evaluation"/>
+    <w:bookmarkStart w:id="39" w:name="impact"/>
     <w:p>
       <w:pPr>
         <w:pStyle w:val="Heading2"/>
       </w:pPr>
       <w:r>
-        <w:t xml:space="preserve">Reproducibility and Evaluation</w:t>
+        <w:t xml:space="preserve">4. Impact</w:t>
       </w:r>
     </w:p>
     <w:p>
@@ -685,19 +1081,15 @@
         <w:pStyle w:val="FirstParagraph"/>
       </w:pPr>
       <w:r>
-        <w:t xml:space="preserve">AEP-Media is evaluated as a conformance-oriented software artifact. The evaluation targets reproducibility, diagnosability, and validation coverage rather than throughput or field deployment. Prior release reports record:</w:t>
-      </w:r>
-    </w:p>
-    <w:p>
-      <w:pPr>
-        <w:pStyle w:val="Compact"/>
-        <w:numPr>
-          <w:ilvl w:val="0"/>
-          <w:numId w:val="1003"/>
-        </w:numPr>
-      </w:pPr>
-      <w:r>
-        <w:t xml:space="preserve">default evaluation: 18 cases,</w:t>
+        <w:t xml:space="preserve">AEP-Media supports research on operation accountability, media evidence packaging, provenance boundaries, and reproducible validation artifacts. It gives researchers a concrete software artifact for asking whether a declared media evidence package is internally consistent and portable. This is useful for experiments that need a stable evidence-object representation rather than ad hoc media files and logs.</w:t>
+      </w:r>
+    </w:p>
+    <w:p>
+      <w:pPr>
+        <w:pStyle w:val="BodyText"/>
+      </w:pPr>
+      <w:r>
+        <w:t xml:space="preserve">The evaluation is conformance-oriented. Prior release reports record 18 default cases, 26 adapter-inclusive cases, 23 optional-tool reporting cases, and 31 combined adapter/optional-tool cases, all with</w:t>
       </w:r>
       <w:r>
         <w:t xml:space="preserve"> </w:t>
@@ -709,19 +1101,67 @@
         <w:t xml:space="preserve">unexpected=0</w:t>
       </w:r>
       <w:r>
-        <w:t xml:space="preserve">;</w:t>
-      </w:r>
-    </w:p>
-    <w:p>
-      <w:pPr>
-        <w:pStyle w:val="Compact"/>
-        <w:numPr>
-          <w:ilvl w:val="0"/>
-          <w:numId w:val="1003"/>
-        </w:numPr>
-      </w:pPr>
-      <w:r>
-        <w:t xml:space="preserve">adapter-inclusive evaluation: 26 cases,</w:t>
+        <w:t xml:space="preserve">. The case categories include valid conformance cases, invalid single-rule cases, bundle tamper cases, strict-time failures, adapter-ingestion cases, and optional-tool reporting cases. Expected failures include missing time context, media hash mismatch, unresolved policy reference, bundle checksum mismatch, path escape, missing clock-trace reference, clock offset threshold exceedance, clock window mismatch, missing PRFT metadata, and declared invalid C2PA-like signature status.</w:t>
+      </w:r>
+    </w:p>
+    <w:p>
+      <w:pPr>
+        <w:pStyle w:val="BodyText"/>
+      </w:pPr>
+      <w:r>
+        <w:t xml:space="preserve">The impact is not that AEP-Media proves authenticity. Its value is that it makes the local evidence object explicit and reproducibly checkable, which is a prerequisite for stronger assurance layers. Researchers can use it as a baseline when comparing provenance models, evidence-package formats, adapter boundaries, or future external-verification appendices. The implementation also complements supply-chain and attestation systems such as in-toto and SLSA by focusing on media-bearing operation evidence rather than build provenance alone [10,11].</w:t>
+      </w:r>
+    </w:p>
+    <w:bookmarkEnd w:id="39"/>
+    <w:bookmarkStart w:id="40" w:name="conclusions"/>
+    <w:p>
+      <w:pPr>
+        <w:pStyle w:val="Heading2"/>
+      </w:pPr>
+      <w:r>
+        <w:t xml:space="preserve">5. Conclusions</w:t>
+      </w:r>
+    </w:p>
+    <w:p>
+      <w:pPr>
+        <w:pStyle w:val="FirstParagraph"/>
+      </w:pPr>
+      <w:r>
+        <w:t xml:space="preserve">AEP-Media is reusable research software for offline validation of time-aware media evidence bundles. It combines a small profile, schemas, examples, command-line validators, bundle verification, strict declared time-trace validation, adapter-only ingestion, reproducible evaluation matrices, and release packaging material.</w:t>
+      </w:r>
+    </w:p>
+    <w:p>
+      <w:pPr>
+        <w:pStyle w:val="BodyText"/>
+      </w:pPr>
+      <w:r>
+        <w:t xml:space="preserve">The current claim is local validation and fixture-based adapter ingestion. AEP-Media detects inconsistencies inside a declared evidence package, but it does not establish that the original media capture event was truthful, authorized, or unmodified before packaging. It does not provide legal admissibility, non-repudiation, trusted timestamping, real PTP proof, full MP4 PRFT parsing, real C2PA signature verification, chain of custody, production deployment, or broad forensic sufficiency.</w:t>
+      </w:r>
+    </w:p>
+    <w:p>
+      <w:pPr>
+        <w:pStyle w:val="BodyText"/>
+      </w:pPr>
+      <w:r>
+        <w:t xml:space="preserve">Future work should keep the local profile semantics stable while adding environment-specific evidence appendices: LinuxPTP traces captured on equipped Linux hosts, ffprobe output from PRFT-bearing media, C2PA CLI reports for real signed assets, and independent reproduction of the evaluation matrix.</w:t>
+      </w:r>
+    </w:p>
+    <w:bookmarkEnd w:id="40"/>
+    <w:bookmarkStart w:id="41" w:name="data-availability"/>
+    <w:p>
+      <w:pPr>
+        <w:pStyle w:val="Heading2"/>
+      </w:pPr>
+      <w:r>
+        <w:t xml:space="preserve">Data availability</w:t>
+      </w:r>
+    </w:p>
+    <w:p>
+      <w:pPr>
+        <w:pStyle w:val="FirstParagraph"/>
+      </w:pPr>
+      <w:r>
+        <w:t xml:space="preserve">The software, selected examples, schemas, reports, and release materials are available in the public GitHub repository at</w:t>
       </w:r>
       <w:r>
         <w:t xml:space="preserve"> </w:t>
@@ -730,22 +1170,13 @@
         <w:rPr>
           <w:rStyle w:val="VerbatimChar"/>
         </w:rPr>
-        <w:t xml:space="preserve">unexpected=0</w:t>
-      </w:r>
-      <w:r>
-        <w:t xml:space="preserve">;</w:t>
-      </w:r>
-    </w:p>
-    <w:p>
-      <w:pPr>
-        <w:pStyle w:val="Compact"/>
-        <w:numPr>
-          <w:ilvl w:val="0"/>
-          <w:numId w:val="1003"/>
-        </w:numPr>
-      </w:pPr>
-      <w:r>
-        <w:t xml:space="preserve">optional-tool reporting evaluation: 23 cases,</w:t>
+        <w:t xml:space="preserve">https://github.com/joy7758/agent-evidence</w:t>
+      </w:r>
+      <w:r>
+        <w:t xml:space="preserve"> </w:t>
+      </w:r>
+      <w:r>
+        <w:t xml:space="preserve">and in the Zenodo archive for AEP-Media v0.1.0 at</w:t>
       </w:r>
       <w:r>
         <w:t xml:space="preserve"> </w:t>
@@ -754,86 +1185,312 @@
         <w:rPr>
           <w:rStyle w:val="VerbatimChar"/>
         </w:rPr>
-        <w:t xml:space="preserve">unexpected=0</w:t>
-      </w:r>
-      <w:r>
-        <w:t xml:space="preserve">;</w:t>
-      </w:r>
-    </w:p>
-    <w:p>
-      <w:pPr>
-        <w:pStyle w:val="Compact"/>
-        <w:numPr>
-          <w:ilvl w:val="0"/>
-          <w:numId w:val="1003"/>
-        </w:numPr>
-      </w:pPr>
-      <w:r>
-        <w:t xml:space="preserve">combined adapter and optional-tool evaluation: 31 cases,</w:t>
+        <w:t xml:space="preserve">https://doi.org/10.5281/zenodo.20107097</w:t>
+      </w:r>
+      <w:r>
+        <w:t xml:space="preserve">. The supplementary package accompanying this submission contains selected schemas, examples, reproducibility commands, evaluation summaries, and claim-boundary documentation.</w:t>
+      </w:r>
+    </w:p>
+    <w:bookmarkEnd w:id="41"/>
+    <w:bookmarkStart w:id="42" w:name="credit-authorship-contribution-statement"/>
+    <w:p>
+      <w:pPr>
+        <w:pStyle w:val="Heading2"/>
+      </w:pPr>
+      <w:r>
+        <w:t xml:space="preserve">CRediT authorship contribution statement</w:t>
+      </w:r>
+    </w:p>
+    <w:p>
+      <w:pPr>
+        <w:pStyle w:val="FirstParagraph"/>
+      </w:pPr>
+      <w:r>
+        <w:t xml:space="preserve">Bin Zhang: Conceptualization, Methodology, Software, Validation, Investigation, Data curation, Writing - original draft, Writing - review and editing, Project administration.</w:t>
+      </w:r>
+    </w:p>
+    <w:bookmarkEnd w:id="42"/>
+    <w:bookmarkStart w:id="43" w:name="declaration-of-competing-interest"/>
+    <w:p>
+      <w:pPr>
+        <w:pStyle w:val="Heading2"/>
+      </w:pPr>
+      <w:r>
+        <w:t xml:space="preserve">Declaration of competing interest</w:t>
+      </w:r>
+    </w:p>
+    <w:p>
+      <w:pPr>
+        <w:pStyle w:val="FirstParagraph"/>
+      </w:pPr>
+      <w:r>
+        <w:t xml:space="preserve">The author declares no known competing financial interests or personal relationships that could have appeared to influence the work reported in this article.</w:t>
+      </w:r>
+    </w:p>
+    <w:bookmarkEnd w:id="43"/>
+    <w:bookmarkStart w:id="44" w:name="funding"/>
+    <w:p>
+      <w:pPr>
+        <w:pStyle w:val="Heading2"/>
+      </w:pPr>
+      <w:r>
+        <w:t xml:space="preserve">Funding</w:t>
+      </w:r>
+    </w:p>
+    <w:p>
+      <w:pPr>
+        <w:pStyle w:val="FirstParagraph"/>
+      </w:pPr>
+      <w:r>
+        <w:t xml:space="preserve">No specific funding was received for this work.</w:t>
+      </w:r>
+    </w:p>
+    <w:bookmarkEnd w:id="44"/>
+    <w:bookmarkStart w:id="45" w:name="X1f74eb43af444059c7518034463b6c89b1cacf4"/>
+    <w:p>
+      <w:pPr>
+        <w:pStyle w:val="Heading2"/>
+      </w:pPr>
+      <w:r>
+        <w:t xml:space="preserve">Declaration of generative AI and AI-assisted technologies in the manuscript preparation process</w:t>
+      </w:r>
+    </w:p>
+    <w:p>
+      <w:pPr>
+        <w:pStyle w:val="FirstParagraph"/>
+      </w:pPr>
+      <w:r>
+        <w:t xml:space="preserve">During the preparation of this work, the author used OpenAI ChatGPT/Codex for manuscript organization, implementation scaffolding, command generation, and wording refinement. After using these tools, the author reviewed and edited the content as needed and takes full responsibility for the content of the submitted article.</w:t>
+      </w:r>
+    </w:p>
+    <w:bookmarkEnd w:id="45"/>
+    <w:bookmarkStart w:id="57" w:name="references"/>
+    <w:p>
+      <w:pPr>
+        <w:pStyle w:val="Heading2"/>
+      </w:pPr>
+      <w:r>
+        <w:t xml:space="preserve">References</w:t>
+      </w:r>
+    </w:p>
+    <w:p>
+      <w:pPr>
+        <w:pStyle w:val="FirstParagraph"/>
+      </w:pPr>
+      <w:r>
+        <w:t xml:space="preserve">[1] W3C. PROV Overview. World Wide Web Consortium.</w:t>
       </w:r>
       <w:r>
         <w:t xml:space="preserve"> </w:t>
       </w:r>
-      <w:r>
-        <w:rPr>
-          <w:rStyle w:val="VerbatimChar"/>
-        </w:rPr>
-        <w:t xml:space="preserve">unexpected=0</w:t>
-      </w:r>
+      <w:hyperlink r:id="rId46">
+        <w:r>
+          <w:rPr>
+            <w:rStyle w:val="Hyperlink"/>
+          </w:rPr>
+          <w:t xml:space="preserve">https://www.w3.org/TR/prov-overview/</w:t>
+        </w:r>
+      </w:hyperlink>
+      <w:r>
+        <w:t xml:space="preserve">; 2013 [accessed 10 May 2026].</w:t>
+      </w:r>
+    </w:p>
+    <w:p>
+      <w:pPr>
+        <w:pStyle w:val="BodyText"/>
+      </w:pPr>
+      <w:r>
+        <w:t xml:space="preserve">[2] W3C. PROV-DM: The PROV Data Model. World Wide Web Consortium.</w:t>
+      </w:r>
+      <w:r>
+        <w:t xml:space="preserve"> </w:t>
+      </w:r>
+      <w:hyperlink r:id="rId47">
+        <w:r>
+          <w:rPr>
+            <w:rStyle w:val="Hyperlink"/>
+          </w:rPr>
+          <w:t xml:space="preserve">https://www.w3.org/TR/prov-dm/</w:t>
+        </w:r>
+      </w:hyperlink>
+      <w:r>
+        <w:t xml:space="preserve">; 2013 [accessed 10 May 2026].</w:t>
+      </w:r>
+    </w:p>
+    <w:p>
+      <w:pPr>
+        <w:pStyle w:val="BodyText"/>
+      </w:pPr>
+      <w:r>
+        <w:t xml:space="preserve">[3] Coalition for Content Provenance and Authenticity. C2PA Technical Specification.</w:t>
+      </w:r>
+      <w:r>
+        <w:t xml:space="preserve"> </w:t>
+      </w:r>
+      <w:hyperlink r:id="rId48">
+        <w:r>
+          <w:rPr>
+            <w:rStyle w:val="Hyperlink"/>
+          </w:rPr>
+          <w:t xml:space="preserve">https://c2pa.org/specifications/</w:t>
+        </w:r>
+      </w:hyperlink>
+      <w:r>
+        <w:t xml:space="preserve">; 2024 [accessed 10 May 2026].</w:t>
+      </w:r>
+    </w:p>
+    <w:p>
+      <w:pPr>
+        <w:pStyle w:val="BodyText"/>
+      </w:pPr>
+      <w:r>
+        <w:t xml:space="preserve">[4] FFmpeg Project. ffprobe Documentation.</w:t>
+      </w:r>
+      <w:r>
+        <w:t xml:space="preserve"> </w:t>
+      </w:r>
+      <w:hyperlink r:id="rId49">
+        <w:r>
+          <w:rPr>
+            <w:rStyle w:val="Hyperlink"/>
+          </w:rPr>
+          <w:t xml:space="preserve">https://ffmpeg.org/ffprobe.html</w:t>
+        </w:r>
+      </w:hyperlink>
+      <w:r>
+        <w:t xml:space="preserve">; 2026 [accessed 10 May 2026].</w:t>
+      </w:r>
+    </w:p>
+    <w:p>
+      <w:pPr>
+        <w:pStyle w:val="BodyText"/>
+      </w:pPr>
+      <w:r>
+        <w:t xml:space="preserve">[5] LinuxPTP Project. ptp4l and phc2sys Documentation.</w:t>
+      </w:r>
+      <w:r>
+        <w:t xml:space="preserve"> </w:t>
+      </w:r>
+      <w:hyperlink r:id="rId50">
+        <w:r>
+          <w:rPr>
+            <w:rStyle w:val="Hyperlink"/>
+          </w:rPr>
+          <w:t xml:space="preserve">https://linuxptp.sourceforge.net/</w:t>
+        </w:r>
+      </w:hyperlink>
+      <w:r>
+        <w:t xml:space="preserve">; 2026 [accessed 10 May 2026].</w:t>
+      </w:r>
+    </w:p>
+    <w:p>
+      <w:pPr>
+        <w:pStyle w:val="BodyText"/>
+      </w:pPr>
+      <w:r>
+        <w:t xml:space="preserve">[6] GStreamer Project. GstPtpClock Documentation.</w:t>
+      </w:r>
+      <w:r>
+        <w:t xml:space="preserve"> </w:t>
+      </w:r>
+      <w:hyperlink r:id="rId51">
+        <w:r>
+          <w:rPr>
+            <w:rStyle w:val="Hyperlink"/>
+          </w:rPr>
+          <w:t xml:space="preserve">https://gstreamer.freedesktop.org/documentation/net/gstptpclock.html</w:t>
+        </w:r>
+      </w:hyperlink>
+      <w:r>
+        <w:t xml:space="preserve">; 2026 [accessed 10 May 2026].</w:t>
+      </w:r>
+    </w:p>
+    <w:p>
+      <w:pPr>
+        <w:pStyle w:val="BodyText"/>
+      </w:pPr>
+      <w:r>
+        <w:t xml:space="preserve">[7] JSON Schema. JSON Schema Core and Validation Specifications.</w:t>
+      </w:r>
+      <w:r>
+        <w:t xml:space="preserve"> </w:t>
+      </w:r>
+      <w:hyperlink r:id="rId52">
+        <w:r>
+          <w:rPr>
+            <w:rStyle w:val="Hyperlink"/>
+          </w:rPr>
+          <w:t xml:space="preserve">https://json-schema.org/specification</w:t>
+        </w:r>
+      </w:hyperlink>
+      <w:r>
+        <w:t xml:space="preserve">; 2026 [accessed 10 May 2026].</w:t>
+      </w:r>
+    </w:p>
+    <w:p>
+      <w:pPr>
+        <w:pStyle w:val="BodyText"/>
+      </w:pPr>
+      <w:r>
+        <w:t xml:space="preserve">[8] Association for Computing Machinery. Artifact Review and Badging.</w:t>
+      </w:r>
+      <w:r>
+        <w:t xml:space="preserve"> </w:t>
+      </w:r>
+      <w:hyperlink r:id="rId53">
+        <w:r>
+          <w:rPr>
+            <w:rStyle w:val="Hyperlink"/>
+          </w:rPr>
+          <w:t xml:space="preserve">https://www.acm.org/publications/policies/artifact-review-and-badging-current</w:t>
+        </w:r>
+      </w:hyperlink>
+      <w:r>
+        <w:t xml:space="preserve">; 2026 [accessed 10 May 2026].</w:t>
+      </w:r>
+    </w:p>
+    <w:p>
+      <w:pPr>
+        <w:pStyle w:val="BodyText"/>
+      </w:pPr>
+      <w:r>
+        <w:t xml:space="preserve">[9] Zhang B. AEP-Media v0.1.0: Offline Validation of Time-Aware Media Evidence Bundles [software]. Zenodo; 2026.</w:t>
+      </w:r>
+      <w:r>
+        <w:t xml:space="preserve"> </w:t>
+      </w:r>
+      <w:hyperlink r:id="rId54">
+        <w:r>
+          <w:rPr>
+            <w:rStyle w:val="Hyperlink"/>
+          </w:rPr>
+          <w:t xml:space="preserve">https://doi.org/10.5281/zenodo.20107097</w:t>
+        </w:r>
+      </w:hyperlink>
       <w:r>
         <w:t xml:space="preserve">.</w:t>
       </w:r>
     </w:p>
     <w:p>
       <w:pPr>
-        <w:pStyle w:val="FirstParagraph"/>
-      </w:pPr>
-      <w:r>
-        <w:t xml:space="preserve">The case categories include valid conformance cases, invalid single-rule cases, bundle tamper cases, strict-time failures, adapter-ingestion cases, and optional-tool reporting cases. Expected failures include missing time context, media hash mismatch, unresolved policy reference, bundle checksum mismatch, path escape, missing clock-trace reference, clock offset threshold exceedance, clock window mismatch, missing PRFT metadata, and declared invalid C2PA-like signature status.</w:t>
-      </w:r>
-    </w:p>
-    <w:bookmarkEnd w:id="39"/>
-    <w:bookmarkStart w:id="40" w:name="impact"/>
-    <w:p>
-      <w:pPr>
-        <w:pStyle w:val="Heading2"/>
-      </w:pPr>
-      <w:r>
-        <w:t xml:space="preserve">Impact</w:t>
-      </w:r>
-    </w:p>
-    <w:p>
-      <w:pPr>
-        <w:pStyle w:val="FirstParagraph"/>
-      </w:pPr>
-      <w:r>
-        <w:t xml:space="preserve">AEP-Media supports research on operation accountability, media evidence packaging, provenance boundaries, and reproducible validation artifacts. It gives researchers a concrete software artifact for asking whether a declared media evidence package is internally consistent and portable. The software may also serve as a baseline for future work that adds real external tool runs, signed manifests, trusted timestamps, or deployed capture pipelines.</w:t>
-      </w:r>
-    </w:p>
-    <w:p>
-      <w:pPr>
         <w:pStyle w:val="BodyText"/>
       </w:pPr>
       <w:r>
-        <w:t xml:space="preserve">The impact is not that AEP-Media proves authenticity. Its value is that it makes the local evidence object explicit and reproducibly checkable, which is a prerequisite for stronger assurance layers.</w:t>
-      </w:r>
-    </w:p>
-    <w:bookmarkEnd w:id="40"/>
-    <w:bookmarkStart w:id="41" w:name="limitations-and-claim-boundary"/>
-    <w:p>
-      <w:pPr>
-        <w:pStyle w:val="Heading2"/>
-      </w:pPr>
-      <w:r>
-        <w:t xml:space="preserve">Limitations and Claim Boundary</w:t>
-      </w:r>
-    </w:p>
-    <w:p>
-      <w:pPr>
-        <w:pStyle w:val="FirstParagraph"/>
-      </w:pPr>
-      <w:r>
-        <w:t xml:space="preserve">AEP-Media detects inconsistencies inside a declared evidence package. It does not establish that the original media capture event was truthful, authorized, or unmodified before packaging. It does not provide legal admissibility, non-repudiation, trusted timestamping, real PTP proof, full MP4 PRFT parsing, real C2PA signature verification, chain of custody, production deployment, or broad forensic sufficiency.</w:t>
+        <w:t xml:space="preserve">[10] in-toto Project. in-toto: Providing farm-to-table guarantees for bits and bytes.</w:t>
+      </w:r>
+      <w:r>
+        <w:t xml:space="preserve"> </w:t>
+      </w:r>
+      <w:hyperlink r:id="rId55">
+        <w:r>
+          <w:rPr>
+            <w:rStyle w:val="Hyperlink"/>
+          </w:rPr>
+          <w:t xml:space="preserve">https://in-toto.io/</w:t>
+        </w:r>
+      </w:hyperlink>
+      <w:r>
+        <w:t xml:space="preserve">; 2026 [accessed 10 May 2026].</w:t>
       </w:r>
     </w:p>
     <w:p>
@@ -841,237 +1498,25 @@
         <w:pStyle w:val="BodyText"/>
       </w:pPr>
       <w:r>
-        <w:t xml:space="preserve">Optional external-tool paths are reporting paths. The reproducible baseline remains local validation and fixture-based adapter ingestion.</w:t>
-      </w:r>
-    </w:p>
-    <w:bookmarkEnd w:id="41"/>
-    <w:bookmarkStart w:id="42" w:name="future-work"/>
-    <w:p>
-      <w:pPr>
-        <w:pStyle w:val="Heading2"/>
-      </w:pPr>
-      <w:r>
-        <w:t xml:space="preserve">Future Work</w:t>
-      </w:r>
-    </w:p>
-    <w:p>
-      <w:pPr>
-        <w:pStyle w:val="FirstParagraph"/>
-      </w:pPr>
-      <w:r>
-        <w:t xml:space="preserve">Future work should keep the local profile semantics stable while adding environment-specific evidence appendices: LinuxPTP traces captured on equipped Linux hosts, ffprobe output from PRFT-bearing media, C2PA CLI reports for real signed assets, and independent reproduction of the evaluation matrix.</w:t>
-      </w:r>
-    </w:p>
-    <w:bookmarkEnd w:id="42"/>
-    <w:bookmarkStart w:id="43" w:name="X1f74eb43af444059c7518034463b6c89b1cacf4"/>
-    <w:p>
-      <w:pPr>
-        <w:pStyle w:val="Heading2"/>
-      </w:pPr>
-      <w:r>
-        <w:t xml:space="preserve">Declaration of Generative AI and AI-assisted Technologies in the Manuscript Preparation Process</w:t>
-      </w:r>
-    </w:p>
-    <w:p>
-      <w:pPr>
-        <w:pStyle w:val="FirstParagraph"/>
-      </w:pPr>
-      <w:r>
-        <w:t xml:space="preserve">During the preparation of this work, the author used OpenAI ChatGPT/Codex for manuscript organization, implementation scaffolding, command generation, and wording refinement. After using these tools, the author reviewed and edited the content as needed and takes full responsibility for the content of the submitted article.</w:t>
-      </w:r>
-    </w:p>
-    <w:bookmarkEnd w:id="43"/>
-    <w:bookmarkStart w:id="44" w:name="references"/>
-    <w:p>
-      <w:pPr>
-        <w:pStyle w:val="Heading2"/>
-      </w:pPr>
-      <w:r>
-        <w:t xml:space="preserve">References</w:t>
-      </w:r>
-    </w:p>
-    <w:p>
-      <w:pPr>
-        <w:pStyle w:val="FirstParagraph"/>
-      </w:pPr>
-      <w:r>
-        <w:t xml:space="preserve">[1] W3C,</w:t>
+        <w:t xml:space="preserve">[11] Supply-chain Levels for Software Artifacts. SLSA Provenance.</w:t>
       </w:r>
       <w:r>
         <w:t xml:space="preserve"> </w:t>
       </w:r>
-      <w:r>
-        <w:t xml:space="preserve">“PROV Overview,”</w:t>
-      </w:r>
-      <w:r>
-        <w:t xml:space="preserve"> </w:t>
-      </w:r>
-      <w:r>
-        <w:t xml:space="preserve">World Wide Web Consortium.</w:t>
-      </w:r>
-    </w:p>
-    <w:p>
-      <w:pPr>
-        <w:pStyle w:val="BodyText"/>
-      </w:pPr>
-      <w:r>
-        <w:t xml:space="preserve">[2] W3C,</w:t>
-      </w:r>
-      <w:r>
-        <w:t xml:space="preserve"> </w:t>
-      </w:r>
-      <w:r>
-        <w:t xml:space="preserve">“PROV-DM: The PROV Data Model,”</w:t>
-      </w:r>
-      <w:r>
-        <w:t xml:space="preserve"> </w:t>
-      </w:r>
-      <w:r>
-        <w:t xml:space="preserve">World Wide Web Consortium.</w:t>
-      </w:r>
-    </w:p>
-    <w:p>
-      <w:pPr>
-        <w:pStyle w:val="BodyText"/>
-      </w:pPr>
-      <w:r>
-        <w:t xml:space="preserve">[3] Coalition for Content Provenance and Authenticity,</w:t>
-      </w:r>
-      <w:r>
-        <w:t xml:space="preserve"> </w:t>
-      </w:r>
-      <w:r>
-        <w:t xml:space="preserve">“C2PA Technical Specification.”</w:t>
-      </w:r>
-    </w:p>
-    <w:p>
-      <w:pPr>
-        <w:pStyle w:val="BodyText"/>
-      </w:pPr>
-      <w:r>
-        <w:t xml:space="preserve">[4] FFmpeg Project,</w:t>
-      </w:r>
-      <w:r>
-        <w:t xml:space="preserve"> </w:t>
-      </w:r>
-      <w:r>
-        <w:t xml:space="preserve">“ffprobe Documentation.”</w:t>
-      </w:r>
-    </w:p>
-    <w:p>
-      <w:pPr>
-        <w:pStyle w:val="BodyText"/>
-      </w:pPr>
-      <w:r>
-        <w:t xml:space="preserve">[5] LinuxPTP Project,</w:t>
-      </w:r>
-      <w:r>
-        <w:t xml:space="preserve"> </w:t>
-      </w:r>
-      <w:r>
-        <w:t xml:space="preserve">“ptp4l and phc2sys Documentation.”</w:t>
-      </w:r>
-    </w:p>
-    <w:p>
-      <w:pPr>
-        <w:pStyle w:val="BodyText"/>
-      </w:pPr>
-      <w:r>
-        <w:t xml:space="preserve">[6] GStreamer Project,</w:t>
-      </w:r>
-      <w:r>
-        <w:t xml:space="preserve"> </w:t>
-      </w:r>
-      <w:r>
-        <w:t xml:space="preserve">“GstPtpClock Documentation.”</w:t>
-      </w:r>
-    </w:p>
-    <w:p>
-      <w:pPr>
-        <w:pStyle w:val="BodyText"/>
-      </w:pPr>
-      <w:r>
-        <w:t xml:space="preserve">[7] JSON Schema,</w:t>
-      </w:r>
-      <w:r>
-        <w:t xml:space="preserve"> </w:t>
-      </w:r>
-      <w:r>
-        <w:t xml:space="preserve">“JSON Schema Core and Validation Specifications.”</w:t>
-      </w:r>
-    </w:p>
-    <w:p>
-      <w:pPr>
-        <w:pStyle w:val="BodyText"/>
-      </w:pPr>
-      <w:r>
-        <w:t xml:space="preserve">[8] Association for Computing Machinery,</w:t>
-      </w:r>
-      <w:r>
-        <w:t xml:space="preserve"> </w:t>
-      </w:r>
-      <w:r>
-        <w:t xml:space="preserve">“Artifact Review and Badging.”</w:t>
-      </w:r>
-    </w:p>
-    <w:p>
-      <w:pPr>
-        <w:pStyle w:val="BodyText"/>
-      </w:pPr>
-      <w:r>
-        <w:t xml:space="preserve">[9] in-toto Project,</w:t>
-      </w:r>
-      <w:r>
-        <w:t xml:space="preserve"> </w:t>
-      </w:r>
-      <w:r>
-        <w:t xml:space="preserve">“in-toto: Providing farm-to-table guarantees for bits and bytes.”</w:t>
-      </w:r>
-    </w:p>
-    <w:p>
-      <w:pPr>
-        <w:pStyle w:val="BodyText"/>
-      </w:pPr>
-      <w:r>
-        <w:t xml:space="preserve">[10] Supply-chain Levels for Software Artifacts,</w:t>
-      </w:r>
-      <w:r>
-        <w:t xml:space="preserve"> </w:t>
-      </w:r>
-      <w:r>
-        <w:t xml:space="preserve">“SLSA Provenance.”</w:t>
-      </w:r>
-    </w:p>
-    <w:p>
-      <w:pPr>
-        <w:pStyle w:val="BodyText"/>
-      </w:pPr>
-      <w:r>
-        <w:t xml:space="preserve">[11] R. Kahn and R. Wilensky,</w:t>
-      </w:r>
-      <w:r>
-        <w:t xml:space="preserve"> </w:t>
-      </w:r>
-      <w:r>
-        <w:t xml:space="preserve">“A Framework for Distributed Digital Object Services.”</w:t>
-      </w:r>
-    </w:p>
-    <w:p>
-      <w:pPr>
-        <w:pStyle w:val="BodyText"/>
-      </w:pPr>
-      <w:r>
-        <w:t xml:space="preserve">[12] DONA Foundation,</w:t>
-      </w:r>
-      <w:r>
-        <w:t xml:space="preserve"> </w:t>
-      </w:r>
-      <w:r>
-        <w:t xml:space="preserve">“Digital Object Interface Protocol Specification.”</w:t>
-      </w:r>
-    </w:p>
-    <w:bookmarkEnd w:id="44"/>
-    <w:bookmarkEnd w:id="45"/>
+      <w:hyperlink r:id="rId56">
+        <w:r>
+          <w:rPr>
+            <w:rStyle w:val="Hyperlink"/>
+          </w:rPr>
+          <w:t xml:space="preserve">https://slsa.dev/spec/v1.0/provenance</w:t>
+        </w:r>
+      </w:hyperlink>
+      <w:r>
+        <w:t xml:space="preserve">; 2026 [accessed 10 May 2026].</w:t>
+      </w:r>
+    </w:p>
+    <w:bookmarkEnd w:id="57"/>
+    <w:bookmarkEnd w:id="58"/>
     <w:sectPr>
       <w:headerReference r:id="rId18" w:type="even"/>
       <w:headerReference r:id="rId19" w:type="default"/>
@@ -3379,12 +3824,6 @@
     <w:abstractNumId w:val="990"/>
   </w:num>
   <w:num w:numId="1001">
-    <w:abstractNumId w:val="991"/>
-  </w:num>
-  <w:num w:numId="1002">
-    <w:abstractNumId w:val="991"/>
-  </w:num>
-  <w:num w:numId="1003">
     <w:abstractNumId w:val="991"/>
   </w:num>
 </w:numbering>

</xml_diff>

<commit_message>
Harden AEP-Media SoftwareX manuscript
</commit_message>
<xml_diff>
--- a/docs/paper/softwarex/final/submission-pack/main/AEP-Media_SoftwareX_Manuscript.docx
+++ b/docs/paper/softwarex/final/submission-pack/main/AEP-Media_SoftwareX_Manuscript.docx
@@ -2,7 +2,7 @@
 <file path=word/document.xml><?xml version="1.0" encoding="utf-8"?>
 <w:document xmlns:w="http://schemas.openxmlformats.org/wordprocessingml/2006/main" xmlns:m="http://schemas.openxmlformats.org/officeDocument/2006/math" xmlns:r="http://schemas.openxmlformats.org/officeDocument/2006/relationships" xmlns:o="urn:schemas-microsoft-com:office:office" xmlns:v="urn:schemas-microsoft-com:vml" xmlns:w10="urn:schemas-microsoft-com:office:word" xmlns:a="http://schemas.openxmlformats.org/drawingml/2006/main" xmlns:pic="http://schemas.openxmlformats.org/drawingml/2006/picture" xmlns:wp="http://schemas.openxmlformats.org/drawingml/2006/wordprocessingDrawing">
   <w:body>
-    <w:bookmarkStart w:id="58" w:name="Xc569c4eb0913b2ae8a7b55d8a4c011a173a2396"/>
+    <w:bookmarkStart w:id="66" w:name="Xc569c4eb0913b2ae8a7b55d8a4c011a173a2396"/>
     <w:p>
       <w:pPr>
         <w:pStyle w:val="Heading1"/>
@@ -67,7 +67,7 @@
         <w:pStyle w:val="FirstParagraph"/>
       </w:pPr>
       <w:r>
-        <w:t xml:space="preserve">AEP-Media is reusable research software for representing a media-bearing operation as a locally checkable evidence bundle. It provides a minimal time-aware media evidence profile, JSON schemas, controlled examples, validators, command-line tools, offline bundle build and verification, strict declared time-trace validation, adapter-only ingestion interfaces, evaluation matrices, and release packaging reports. The software is intended for researchers studying operation accountability, media evidence packaging, provenance boundaries, and reproducible validation artifacts. AEP-Media checks profile identity, required fields, reference closure, artifact hashes, path safety, bundle checksums, declared clock-trace coverage, clock-trace summaries, and offset/jitter thresholds. Its evaluation materials exercise valid, invalid, tamper, adapter-ingestion, and optional-tool reporting cases with expected pass/fail behavior. The current claim is local validation and fixture-based adapter ingestion. AEP-Media does not claim legal admissibility, non-repudiation, trusted timestamping, real PTP proof, full MP4 PRFT parsing, real C2PA signature verification, chain of custody, or production deployment.</w:t>
+        <w:t xml:space="preserve">AEP-Media is reusable research software for local validation of time-aware media evidence bundles. It provides profiles, JSON schemas, command-line validators, examples, offline bundle build and verification, strict declared time-trace validation, adapter-only ingestion, reproducible evaluation matrices, and release packaging material. The software is intended for researchers studying operation accountability, media evidence packaging, provenance boundaries, and reproducible validation artifacts. AEP-Media checks profile identity, required fields, reference closure, artifact hashes, path safety, bundle checksums, declared clock-trace coverage, sample summaries, and offset/jitter thresholds. The v0.1.0 release is archived with a Zenodo DOI and includes a supplementary package with reproducibility notes, selected schemas, examples, reports, and claim-boundary documentation. The claim is local validation and fixture-based adapter ingestion, not external authenticity, legal admissibility, non-repudiation, trusted timestamping, or production deployment.</w:t>
       </w:r>
     </w:p>
     <w:bookmarkEnd w:id="33"/>
@@ -89,7 +89,419 @@
       </w:r>
     </w:p>
     <w:bookmarkEnd w:id="34"/>
-    <w:bookmarkStart w:id="35" w:name="metadata"/>
+    <w:bookmarkStart w:id="38" w:name="software-availability"/>
+    <w:p>
+      <w:pPr>
+        <w:pStyle w:val="Heading2"/>
+      </w:pPr>
+      <w:r>
+        <w:t xml:space="preserve">Software availability</w:t>
+      </w:r>
+    </w:p>
+    <w:p>
+      <w:pPr>
+        <w:pStyle w:val="Compact"/>
+        <w:numPr>
+          <w:ilvl w:val="0"/>
+          <w:numId w:val="1001"/>
+        </w:numPr>
+      </w:pPr>
+      <w:r>
+        <w:t xml:space="preserve">Software name: AEP-Media</w:t>
+      </w:r>
+    </w:p>
+    <w:p>
+      <w:pPr>
+        <w:pStyle w:val="Compact"/>
+        <w:numPr>
+          <w:ilvl w:val="0"/>
+          <w:numId w:val="1001"/>
+        </w:numPr>
+      </w:pPr>
+      <w:r>
+        <w:t xml:space="preserve">Parent repository/package:</w:t>
+      </w:r>
+      <w:r>
+        <w:t xml:space="preserve"> </w:t>
+      </w:r>
+      <w:r>
+        <w:rPr>
+          <w:rStyle w:val="VerbatimChar"/>
+        </w:rPr>
+        <w:t xml:space="preserve">agent-evidence</w:t>
+      </w:r>
+      <w:r>
+        <w:t xml:space="preserve"> </w:t>
+      </w:r>
+      <w:r>
+        <w:t xml:space="preserve">/</w:t>
+      </w:r>
+      <w:r>
+        <w:t xml:space="preserve"> </w:t>
+      </w:r>
+      <w:r>
+        <w:rPr>
+          <w:rStyle w:val="VerbatimChar"/>
+        </w:rPr>
+        <w:t xml:space="preserve">agent_evidence</w:t>
+      </w:r>
+    </w:p>
+    <w:p>
+      <w:pPr>
+        <w:pStyle w:val="Compact"/>
+        <w:numPr>
+          <w:ilvl w:val="0"/>
+          <w:numId w:val="1001"/>
+        </w:numPr>
+      </w:pPr>
+      <w:r>
+        <w:t xml:space="preserve">Version:</w:t>
+      </w:r>
+      <w:r>
+        <w:t xml:space="preserve"> </w:t>
+      </w:r>
+      <w:r>
+        <w:rPr>
+          <w:rStyle w:val="VerbatimChar"/>
+        </w:rPr>
+        <w:t xml:space="preserve">aep-media-v0.1.0</w:t>
+      </w:r>
+    </w:p>
+    <w:p>
+      <w:pPr>
+        <w:pStyle w:val="Compact"/>
+        <w:numPr>
+          <w:ilvl w:val="0"/>
+          <w:numId w:val="1001"/>
+        </w:numPr>
+      </w:pPr>
+      <w:r>
+        <w:t xml:space="preserve">Repository:</w:t>
+      </w:r>
+      <w:r>
+        <w:t xml:space="preserve"> </w:t>
+      </w:r>
+      <w:hyperlink r:id="rId35">
+        <w:r>
+          <w:rPr>
+            <w:rStyle w:val="Hyperlink"/>
+          </w:rPr>
+          <w:t xml:space="preserve">https://github.com/joy7758/agent-evidence</w:t>
+        </w:r>
+      </w:hyperlink>
+    </w:p>
+    <w:p>
+      <w:pPr>
+        <w:pStyle w:val="Compact"/>
+        <w:numPr>
+          <w:ilvl w:val="0"/>
+          <w:numId w:val="1001"/>
+        </w:numPr>
+      </w:pPr>
+      <w:r>
+        <w:t xml:space="preserve">GitHub release:</w:t>
+      </w:r>
+      <w:r>
+        <w:t xml:space="preserve"> </w:t>
+      </w:r>
+      <w:hyperlink r:id="rId36">
+        <w:r>
+          <w:rPr>
+            <w:rStyle w:val="Hyperlink"/>
+          </w:rPr>
+          <w:t xml:space="preserve">https://github.com/joy7758/agent-evidence/releases/tag/aep-media-v0.1.0</w:t>
+        </w:r>
+      </w:hyperlink>
+    </w:p>
+    <w:p>
+      <w:pPr>
+        <w:pStyle w:val="Compact"/>
+        <w:numPr>
+          <w:ilvl w:val="0"/>
+          <w:numId w:val="1001"/>
+        </w:numPr>
+      </w:pPr>
+      <w:r>
+        <w:t xml:space="preserve">Zenodo archive DOI:</w:t>
+      </w:r>
+      <w:r>
+        <w:t xml:space="preserve"> </w:t>
+      </w:r>
+      <w:r>
+        <w:rPr>
+          <w:rStyle w:val="VerbatimChar"/>
+        </w:rPr>
+        <w:t xml:space="preserve">10.5281/zenodo.20107097</w:t>
+      </w:r>
+    </w:p>
+    <w:p>
+      <w:pPr>
+        <w:pStyle w:val="Compact"/>
+        <w:numPr>
+          <w:ilvl w:val="0"/>
+          <w:numId w:val="1001"/>
+        </w:numPr>
+      </w:pPr>
+      <w:r>
+        <w:t xml:space="preserve">Zenodo record:</w:t>
+      </w:r>
+      <w:r>
+        <w:t xml:space="preserve"> </w:t>
+      </w:r>
+      <w:hyperlink r:id="rId37">
+        <w:r>
+          <w:rPr>
+            <w:rStyle w:val="Hyperlink"/>
+          </w:rPr>
+          <w:t xml:space="preserve">https://zenodo.org/records/20107097</w:t>
+        </w:r>
+      </w:hyperlink>
+    </w:p>
+    <w:p>
+      <w:pPr>
+        <w:pStyle w:val="Compact"/>
+        <w:numPr>
+          <w:ilvl w:val="0"/>
+          <w:numId w:val="1001"/>
+        </w:numPr>
+      </w:pPr>
+      <w:r>
+        <w:t xml:space="preserve">License: Apache-2.0</w:t>
+      </w:r>
+    </w:p>
+    <w:p>
+      <w:pPr>
+        <w:pStyle w:val="Compact"/>
+        <w:numPr>
+          <w:ilvl w:val="0"/>
+          <w:numId w:val="1001"/>
+        </w:numPr>
+      </w:pPr>
+      <w:r>
+        <w:t xml:space="preserve">Programming language: Python</w:t>
+      </w:r>
+    </w:p>
+    <w:p>
+      <w:pPr>
+        <w:pStyle w:val="Compact"/>
+        <w:numPr>
+          <w:ilvl w:val="0"/>
+          <w:numId w:val="1001"/>
+        </w:numPr>
+      </w:pPr>
+      <w:r>
+        <w:t xml:space="preserve">Operating system: platform-independent Python package; validated in the repository test environment described in the release reports.</w:t>
+      </w:r>
+    </w:p>
+    <w:p>
+      <w:pPr>
+        <w:pStyle w:val="Compact"/>
+        <w:numPr>
+          <w:ilvl w:val="0"/>
+          <w:numId w:val="1001"/>
+        </w:numPr>
+      </w:pPr>
+      <w:r>
+        <w:t xml:space="preserve">Documentation:</w:t>
+      </w:r>
+      <w:r>
+        <w:t xml:space="preserve"> </w:t>
+      </w:r>
+      <w:r>
+        <w:rPr>
+          <w:rStyle w:val="VerbatimChar"/>
+        </w:rPr>
+        <w:t xml:space="preserve">README.md</w:t>
+      </w:r>
+      <w:r>
+        <w:t xml:space="preserve">,</w:t>
+      </w:r>
+      <w:r>
+        <w:t xml:space="preserve"> </w:t>
+      </w:r>
+      <w:r>
+        <w:rPr>
+          <w:rStyle w:val="VerbatimChar"/>
+        </w:rPr>
+        <w:t xml:space="preserve">spec/</w:t>
+      </w:r>
+      <w:r>
+        <w:t xml:space="preserve">,</w:t>
+      </w:r>
+      <w:r>
+        <w:t xml:space="preserve"> </w:t>
+      </w:r>
+      <w:r>
+        <w:rPr>
+          <w:rStyle w:val="VerbatimChar"/>
+        </w:rPr>
+        <w:t xml:space="preserve">schema/</w:t>
+      </w:r>
+      <w:r>
+        <w:t xml:space="preserve">,</w:t>
+      </w:r>
+      <w:r>
+        <w:t xml:space="preserve"> </w:t>
+      </w:r>
+      <w:r>
+        <w:rPr>
+          <w:rStyle w:val="VerbatimChar"/>
+        </w:rPr>
+        <w:t xml:space="preserve">examples/media/</w:t>
+      </w:r>
+      <w:r>
+        <w:t xml:space="preserve">,</w:t>
+      </w:r>
+      <w:r>
+        <w:t xml:space="preserve"> </w:t>
+      </w:r>
+      <w:r>
+        <w:rPr>
+          <w:rStyle w:val="VerbatimChar"/>
+        </w:rPr>
+        <w:t xml:space="preserve">demo/</w:t>
+      </w:r>
+      <w:r>
+        <w:t xml:space="preserve">,</w:t>
+      </w:r>
+      <w:r>
+        <w:t xml:space="preserve"> </w:t>
+      </w:r>
+      <w:r>
+        <w:rPr>
+          <w:rStyle w:val="VerbatimChar"/>
+        </w:rPr>
+        <w:t xml:space="preserve">docs/reports/</w:t>
+      </w:r>
+      <w:r>
+        <w:t xml:space="preserve">, and</w:t>
+      </w:r>
+      <w:r>
+        <w:t xml:space="preserve"> </w:t>
+      </w:r>
+      <w:r>
+        <w:rPr>
+          <w:rStyle w:val="VerbatimChar"/>
+        </w:rPr>
+        <w:t xml:space="preserve">docs/paper/softwarex/</w:t>
+      </w:r>
+      <w:r>
+        <w:t xml:space="preserve">.</w:t>
+      </w:r>
+    </w:p>
+    <w:p>
+      <w:pPr>
+        <w:pStyle w:val="Compact"/>
+        <w:numPr>
+          <w:ilvl w:val="0"/>
+          <w:numId w:val="1001"/>
+        </w:numPr>
+      </w:pPr>
+      <w:r>
+        <w:t xml:space="preserve">Tests:</w:t>
+      </w:r>
+      <w:r>
+        <w:t xml:space="preserve"> </w:t>
+      </w:r>
+      <w:r>
+        <w:rPr>
+          <w:rStyle w:val="VerbatimChar"/>
+        </w:rPr>
+        <w:t xml:space="preserve">tests/test_media_*.py</w:t>
+      </w:r>
+      <w:r>
+        <w:t xml:space="preserve"> </w:t>
+      </w:r>
+      <w:r>
+        <w:t xml:space="preserve">and related readiness tests.</w:t>
+      </w:r>
+    </w:p>
+    <w:p>
+      <w:pPr>
+        <w:pStyle w:val="Compact"/>
+        <w:numPr>
+          <w:ilvl w:val="0"/>
+          <w:numId w:val="1001"/>
+        </w:numPr>
+      </w:pPr>
+      <w:r>
+        <w:t xml:space="preserve">Main commands:</w:t>
+      </w:r>
+      <w:r>
+        <w:t xml:space="preserve"> </w:t>
+      </w:r>
+      <w:r>
+        <w:rPr>
+          <w:rStyle w:val="VerbatimChar"/>
+        </w:rPr>
+        <w:t xml:space="preserve">validate-media-profile</w:t>
+      </w:r>
+      <w:r>
+        <w:t xml:space="preserve">,</w:t>
+      </w:r>
+      <w:r>
+        <w:t xml:space="preserve"> </w:t>
+      </w:r>
+      <w:r>
+        <w:rPr>
+          <w:rStyle w:val="VerbatimChar"/>
+        </w:rPr>
+        <w:t xml:space="preserve">build-media-bundle</w:t>
+      </w:r>
+      <w:r>
+        <w:t xml:space="preserve">,</w:t>
+      </w:r>
+      <w:r>
+        <w:t xml:space="preserve"> </w:t>
+      </w:r>
+      <w:r>
+        <w:rPr>
+          <w:rStyle w:val="VerbatimChar"/>
+        </w:rPr>
+        <w:t xml:space="preserve">verify-media-bundle</w:t>
+      </w:r>
+      <w:r>
+        <w:t xml:space="preserve">,</w:t>
+      </w:r>
+      <w:r>
+        <w:t xml:space="preserve"> </w:t>
+      </w:r>
+      <w:r>
+        <w:rPr>
+          <w:rStyle w:val="VerbatimChar"/>
+        </w:rPr>
+        <w:t xml:space="preserve">validate-media-time-profile</w:t>
+      </w:r>
+      <w:r>
+        <w:t xml:space="preserve">,</w:t>
+      </w:r>
+      <w:r>
+        <w:t xml:space="preserve"> </w:t>
+      </w:r>
+      <w:r>
+        <w:rPr>
+          <w:rStyle w:val="VerbatimChar"/>
+        </w:rPr>
+        <w:t xml:space="preserve">run-media-evaluation</w:t>
+      </w:r>
+      <w:r>
+        <w:t xml:space="preserve">, and</w:t>
+      </w:r>
+      <w:r>
+        <w:t xml:space="preserve"> </w:t>
+      </w:r>
+      <w:r>
+        <w:rPr>
+          <w:rStyle w:val="VerbatimChar"/>
+        </w:rPr>
+        <w:t xml:space="preserve">build-aep-media-release-pack</w:t>
+      </w:r>
+      <w:r>
+        <w:t xml:space="preserve">.</w:t>
+      </w:r>
+    </w:p>
+    <w:bookmarkEnd w:id="38"/>
+    <w:bookmarkStart w:id="39" w:name="metadata"/>
     <w:p>
       <w:pPr>
         <w:pStyle w:val="Heading2"/>
@@ -215,12 +627,14 @@
             <w:pPr>
               <w:pStyle w:val="Compact"/>
             </w:pPr>
-            <w:r>
-              <w:rPr>
-                <w:rStyle w:val="VerbatimChar"/>
-              </w:rPr>
-              <w:t xml:space="preserve">https://github.com/joy7758/agent-evidence</w:t>
-            </w:r>
+            <w:hyperlink r:id="rId35">
+              <w:r>
+                <w:rPr>
+                  <w:rStyle w:val="Hyperlink"/>
+                </w:rPr>
+                <w:t xml:space="preserve">https://github.com/joy7758/agent-evidence</w:t>
+              </w:r>
+            </w:hyperlink>
           </w:p>
         </w:tc>
       </w:tr>
@@ -324,7 +738,7 @@
               <w:pStyle w:val="Compact"/>
             </w:pPr>
             <w:r>
-              <w:t xml:space="preserve">Python; JSON Schema; pytest; Click CLI; Pandoc/LaTeX only for manuscript packaging</w:t>
+              <w:t xml:space="preserve">Python; JSON Schema; pytest; Click CLI; Pandoc/Word only for manuscript packaging</w:t>
             </w:r>
           </w:p>
         </w:tc>
@@ -395,28 +809,16 @@
               <w:pStyle w:val="Compact"/>
             </w:pPr>
             <w:r>
-              <w:t xml:space="preserve">If available, link to developer documentation/manual</w:t>
-            </w:r>
-          </w:p>
-        </w:tc>
-        <w:tc>
-          <w:tcPr/>
-          <w:p>
-            <w:pPr>
-              <w:pStyle w:val="Compact"/>
-            </w:pPr>
-            <w:r>
-              <w:rPr>
-                <w:rStyle w:val="VerbatimChar"/>
-              </w:rPr>
-              <w:t xml:space="preserve">https://github.com/joy7758/agent-evidence</w:t>
-            </w:r>
-            <w:r>
-              <w:t xml:space="preserve">; repository documentation under</w:t>
-            </w:r>
-            <w:r>
-              <w:t xml:space="preserve"> </w:t>
-            </w:r>
+              <w:t xml:space="preserve">Developer documentation/manual</w:t>
+            </w:r>
+          </w:p>
+        </w:tc>
+        <w:tc>
+          <w:tcPr/>
+          <w:p>
+            <w:pPr>
+              <w:pStyle w:val="Compact"/>
+            </w:pPr>
             <w:r>
               <w:rPr>
                 <w:rStyle w:val="VerbatimChar"/>
@@ -522,8 +924,8 @@
         </w:tc>
       </w:tr>
     </w:tbl>
-    <w:bookmarkEnd w:id="35"/>
-    <w:bookmarkStart w:id="36" w:name="motivation-and-significance"/>
+    <w:bookmarkEnd w:id="39"/>
+    <w:bookmarkStart w:id="40" w:name="motivation-and-significance"/>
     <w:p>
       <w:pPr>
         <w:pStyle w:val="Heading2"/>
@@ -537,7 +939,7 @@
         <w:pStyle w:val="FirstParagraph"/>
       </w:pPr>
       <w:r>
-        <w:t xml:space="preserve">Researchers working with media-bearing operations often need to review disconnected artifacts: media files, logs, provenance declarations, timing metadata, policy references, and validation reports. These objects are difficult to inspect consistently when they are not bound into a local evidence object with explicit validation semantics. AEP-Media addresses this gap by providing a reusable software layer for turning such materials into locally checkable evidence bundles with machine-readable failure codes.</w:t>
+        <w:t xml:space="preserve">Researchers working with media-bearing operations often need to review disconnected artifacts: media files, logs, provenance declarations, timing metadata, policy references, and validation reports. These artifacts are difficult to inspect consistently when they are not bound into a local evidence object with explicit validation semantics. AEP-Media addresses this gap by providing a reusable software layer for turning such materials into locally checkable evidence bundles with machine-readable failure codes.</w:t>
       </w:r>
     </w:p>
     <w:p>
@@ -545,7 +947,7 @@
         <w:pStyle w:val="BodyText"/>
       </w:pPr>
       <w:r>
-        <w:t xml:space="preserve">The problem is deliberately bounded. AEP-Media is not a legal evidence platform and does not attempt to prove external authenticity. Its purpose is to make the local validation boundary explicit: which fields must be present, which references must close, which files must match declared hashes, which time traces cover a declared window, and which failures are reported when a controlled rule is broken. This local conformance layer is useful before stronger external assurance mechanisms such as signing, trusted timestamping, or deployed capture pipelines are added.</w:t>
+        <w:t xml:space="preserve">Existing tools cover adjacent surfaces but not the local validation boundary targeted here. PROV-style models describe provenance relationships [1,2], C2PA describes content provenance and manifest validation states [3], FFmpeg/ffprobe exposes media metadata and timing surfaces [4,5], LinuxPTP supports clock-synchronization workflows [6,7], and GStreamer exposes a PTP clock interface for media pipelines [8]. AEP-Media does not replace these tools. It provides a local evidence-bundle validation layer that binds operation, policy, media artifacts, declared time traces, provenance references, hashes, and failure codes into one reproducible software artifact.</w:t>
       </w:r>
     </w:p>
     <w:p>
@@ -553,11 +955,11 @@
         <w:pStyle w:val="BodyText"/>
       </w:pPr>
       <w:r>
-        <w:t xml:space="preserve">AEP-Media is positioned next to provenance, media-authenticity, timing, and artifact-review surfaces rather than as a replacement for them. W3C PROV provides general provenance concepts [1,2]. C2PA focuses on content provenance and manifest-based authenticity [3]. FFmpeg/ffprobe and LinuxPTP expose media timing and clock-synchronization surfaces [4,5], while GStreamer provides a PTP clock interface for media pipelines [6]. JSON Schema supports structured validation [7], and artifact-review practices emphasize inspectable and reproducible software packages [8]. AEP-Media contributes a concrete local validation boundary that binds media artifacts, declared provenance, declared time traces, bundle integrity, and failure codes into one reusable research software artifact.</w:t>
-      </w:r>
-    </w:p>
-    <w:bookmarkEnd w:id="36"/>
-    <w:bookmarkStart w:id="37" w:name="software-description"/>
+        <w:t xml:space="preserve">The problem is deliberately bounded. AEP-Media is not a legal evidence platform and does not prove external authenticity. Its purpose is to make the local validation boundary explicit: which fields must be present, which references must close, which files must match declared hashes, which time traces cover a declared window, and which failures are reported when a controlled rule is broken. This local conformance layer is useful before stronger external assurance mechanisms such as signing, trusted timestamping, or deployed capture pipelines are added.</w:t>
+      </w:r>
+    </w:p>
+    <w:bookmarkEnd w:id="40"/>
+    <w:bookmarkStart w:id="41" w:name="software-description"/>
     <w:p>
       <w:pPr>
         <w:pStyle w:val="Heading2"/>
@@ -618,211 +1020,566 @@
         <w:pStyle w:val="BodyText"/>
       </w:pPr>
       <w:r>
-        <w:t xml:space="preserve">The main modules are:</w:t>
-      </w:r>
-    </w:p>
-    <w:p>
-      <w:pPr>
-        <w:pStyle w:val="Compact"/>
-        <w:numPr>
-          <w:ilvl w:val="0"/>
-          <w:numId w:val="1001"/>
-        </w:numPr>
-      </w:pPr>
+        <w:t xml:space="preserve">Table 1 summarizes the main software components and user-facing functions. Module locations are under the</w:t>
+      </w:r>
+      <w:r>
+        <w:t xml:space="preserve"> </w:t>
+      </w:r>
       <w:r>
         <w:rPr>
           <w:rStyle w:val="VerbatimChar"/>
         </w:rPr>
-        <w:t xml:space="preserve">agent_evidence/media_profile.py</w:t>
-      </w:r>
-      <w:r>
-        <w:t xml:space="preserve">: media profile validation.</w:t>
-      </w:r>
-    </w:p>
-    <w:p>
-      <w:pPr>
-        <w:pStyle w:val="Compact"/>
-        <w:numPr>
-          <w:ilvl w:val="0"/>
-          <w:numId w:val="1001"/>
-        </w:numPr>
+        <w:t xml:space="preserve">agent_evidence/</w:t>
+      </w:r>
+      <w:r>
+        <w:t xml:space="preserve"> </w:t>
+      </w:r>
+      <w:r>
+        <w:t xml:space="preserve">package unless otherwise noted.</w:t>
+      </w:r>
+    </w:p>
+    <w:tbl>
+      <w:tblPr>
+        <w:tblStyle w:val="Table"/>
+        <w:tblW w:type="pct" w:w="5000"/>
+        <w:tblLayout w:type="fixed"/>
+        <w:tblLook w:firstRow="1" w:lastRow="0" w:firstColumn="0" w:lastColumn="0" w:noHBand="0" w:noVBand="0" w:val="0020"/>
+      </w:tblPr>
+      <w:tblGrid>
+        <w:gridCol w:w="1980"/>
+        <w:gridCol w:w="1980"/>
+        <w:gridCol w:w="1980"/>
+        <w:gridCol w:w="1980"/>
+      </w:tblGrid>
+      <w:tr>
+        <w:trPr>
+          <w:tblHeader w:val="on"/>
+        </w:trPr>
+        <w:tc>
+          <w:tcPr/>
+          <w:p>
+            <w:pPr>
+              <w:pStyle w:val="Compact"/>
+            </w:pPr>
+            <w:r>
+              <w:t xml:space="preserve">Component</w:t>
+            </w:r>
+          </w:p>
+        </w:tc>
+        <w:tc>
+          <w:tcPr/>
+          <w:p>
+            <w:pPr>
+              <w:pStyle w:val="Compact"/>
+            </w:pPr>
+            <w:r>
+              <w:t xml:space="preserve">Module or location</w:t>
+            </w:r>
+          </w:p>
+        </w:tc>
+        <w:tc>
+          <w:tcPr/>
+          <w:p>
+            <w:pPr>
+              <w:pStyle w:val="Compact"/>
+            </w:pPr>
+            <w:r>
+              <w:t xml:space="preserve">Function</w:t>
+            </w:r>
+          </w:p>
+        </w:tc>
+        <w:tc>
+          <w:tcPr/>
+          <w:p>
+            <w:pPr>
+              <w:pStyle w:val="Compact"/>
+            </w:pPr>
+            <w:r>
+              <w:t xml:space="preserve">Command or artifact</w:t>
+            </w:r>
+          </w:p>
+        </w:tc>
+      </w:tr>
+      <w:tr>
+        <w:tc>
+          <w:tcPr/>
+          <w:p>
+            <w:pPr>
+              <w:pStyle w:val="Compact"/>
+            </w:pPr>
+            <w:r>
+              <w:t xml:space="preserve">Profile validator</w:t>
+            </w:r>
+          </w:p>
+        </w:tc>
+        <w:tc>
+          <w:tcPr/>
+          <w:p>
+            <w:pPr>
+              <w:pStyle w:val="Compact"/>
+            </w:pPr>
+            <w:r>
+              <w:rPr>
+                <w:rStyle w:val="VerbatimChar"/>
+              </w:rPr>
+              <w:t xml:space="preserve">media_profile.py</w:t>
+            </w:r>
+          </w:p>
+        </w:tc>
+        <w:tc>
+          <w:tcPr/>
+          <w:p>
+            <w:pPr>
+              <w:pStyle w:val="Compact"/>
+            </w:pPr>
+            <w:r>
+              <w:t xml:space="preserve">Profile checks</w:t>
+            </w:r>
+          </w:p>
+        </w:tc>
+        <w:tc>
+          <w:tcPr/>
+          <w:p>
+            <w:pPr>
+              <w:pStyle w:val="Compact"/>
+            </w:pPr>
+            <w:r>
+              <w:rPr>
+                <w:rStyle w:val="VerbatimChar"/>
+              </w:rPr>
+              <w:t xml:space="preserve">validate-media-profile</w:t>
+            </w:r>
+          </w:p>
+        </w:tc>
+      </w:tr>
+      <w:tr>
+        <w:tc>
+          <w:tcPr/>
+          <w:p>
+            <w:pPr>
+              <w:pStyle w:val="Compact"/>
+            </w:pPr>
+            <w:r>
+              <w:t xml:space="preserve">Bundle builder/verifier</w:t>
+            </w:r>
+          </w:p>
+        </w:tc>
+        <w:tc>
+          <w:tcPr/>
+          <w:p>
+            <w:pPr>
+              <w:pStyle w:val="Compact"/>
+            </w:pPr>
+            <w:r>
+              <w:rPr>
+                <w:rStyle w:val="VerbatimChar"/>
+              </w:rPr>
+              <w:t xml:space="preserve">media_bundle.py</w:t>
+            </w:r>
+          </w:p>
+        </w:tc>
+        <w:tc>
+          <w:tcPr/>
+          <w:p>
+            <w:pPr>
+              <w:pStyle w:val="Compact"/>
+            </w:pPr>
+            <w:r>
+              <w:t xml:space="preserve">Bundle checks</w:t>
+            </w:r>
+          </w:p>
+        </w:tc>
+        <w:tc>
+          <w:tcPr/>
+          <w:p>
+            <w:pPr>
+              <w:pStyle w:val="Compact"/>
+            </w:pPr>
+            <w:r>
+              <w:rPr>
+                <w:rStyle w:val="VerbatimChar"/>
+              </w:rPr>
+              <w:t xml:space="preserve">build-media-bundle</w:t>
+            </w:r>
+            <w:r>
+              <w:t xml:space="preserve">;</w:t>
+            </w:r>
+            <w:r>
+              <w:t xml:space="preserve"> </w:t>
+            </w:r>
+            <w:r>
+              <w:rPr>
+                <w:rStyle w:val="VerbatimChar"/>
+              </w:rPr>
+              <w:t xml:space="preserve">verify-media-bundle</w:t>
+            </w:r>
+          </w:p>
+        </w:tc>
+      </w:tr>
+      <w:tr>
+        <w:tc>
+          <w:tcPr/>
+          <w:p>
+            <w:pPr>
+              <w:pStyle w:val="Compact"/>
+            </w:pPr>
+            <w:r>
+              <w:t xml:space="preserve">Strict-time validator</w:t>
+            </w:r>
+          </w:p>
+        </w:tc>
+        <w:tc>
+          <w:tcPr/>
+          <w:p>
+            <w:pPr>
+              <w:pStyle w:val="Compact"/>
+            </w:pPr>
+            <w:r>
+              <w:rPr>
+                <w:rStyle w:val="VerbatimChar"/>
+              </w:rPr>
+              <w:t xml:space="preserve">media_time.py</w:t>
+            </w:r>
+          </w:p>
+        </w:tc>
+        <w:tc>
+          <w:tcPr/>
+          <w:p>
+            <w:pPr>
+              <w:pStyle w:val="Compact"/>
+            </w:pPr>
+            <w:r>
+              <w:t xml:space="preserve">Clock-trace checks</w:t>
+            </w:r>
+          </w:p>
+        </w:tc>
+        <w:tc>
+          <w:tcPr/>
+          <w:p>
+            <w:pPr>
+              <w:pStyle w:val="Compact"/>
+            </w:pPr>
+            <w:r>
+              <w:rPr>
+                <w:rStyle w:val="VerbatimChar"/>
+              </w:rPr>
+              <w:t xml:space="preserve">validate-media-time-profile</w:t>
+            </w:r>
+          </w:p>
+        </w:tc>
+      </w:tr>
+      <w:tr>
+        <w:tc>
+          <w:tcPr/>
+          <w:p>
+            <w:pPr>
+              <w:pStyle w:val="Compact"/>
+            </w:pPr>
+            <w:r>
+              <w:t xml:space="preserve">LinuxPTP adapter</w:t>
+            </w:r>
+          </w:p>
+        </w:tc>
+        <w:tc>
+          <w:tcPr/>
+          <w:p>
+            <w:pPr>
+              <w:pStyle w:val="Compact"/>
+            </w:pPr>
+            <w:r>
+              <w:rPr>
+                <w:rStyle w:val="VerbatimChar"/>
+              </w:rPr>
+              <w:t xml:space="preserve">adapters/linuxptp.py</w:t>
+            </w:r>
+          </w:p>
+        </w:tc>
+        <w:tc>
+          <w:tcPr/>
+          <w:p>
+            <w:pPr>
+              <w:pStyle w:val="Compact"/>
+            </w:pPr>
+            <w:r>
+              <w:t xml:space="preserve">Trace ingestion</w:t>
+            </w:r>
+          </w:p>
+        </w:tc>
+        <w:tc>
+          <w:tcPr/>
+          <w:p>
+            <w:pPr>
+              <w:pStyle w:val="Compact"/>
+            </w:pPr>
+            <w:r>
+              <w:rPr>
+                <w:rStyle w:val="VerbatimChar"/>
+              </w:rPr>
+              <w:t xml:space="preserve">ingest-linuxptp-trace</w:t>
+            </w:r>
+          </w:p>
+        </w:tc>
+      </w:tr>
+      <w:tr>
+        <w:tc>
+          <w:tcPr/>
+          <w:p>
+            <w:pPr>
+              <w:pStyle w:val="Compact"/>
+            </w:pPr>
+            <w:r>
+              <w:t xml:space="preserve">FFmpeg PRFT adapter</w:t>
+            </w:r>
+          </w:p>
+        </w:tc>
+        <w:tc>
+          <w:tcPr/>
+          <w:p>
+            <w:pPr>
+              <w:pStyle w:val="Compact"/>
+            </w:pPr>
+            <w:r>
+              <w:rPr>
+                <w:rStyle w:val="VerbatimChar"/>
+              </w:rPr>
+              <w:t xml:space="preserve">adapters/ffmpeg_prft.py</w:t>
+            </w:r>
+          </w:p>
+        </w:tc>
+        <w:tc>
+          <w:tcPr/>
+          <w:p>
+            <w:pPr>
+              <w:pStyle w:val="Compact"/>
+            </w:pPr>
+            <w:r>
+              <w:t xml:space="preserve">PRFT metadata ingestion</w:t>
+            </w:r>
+          </w:p>
+        </w:tc>
+        <w:tc>
+          <w:tcPr/>
+          <w:p>
+            <w:pPr>
+              <w:pStyle w:val="Compact"/>
+            </w:pPr>
+            <w:r>
+              <w:rPr>
+                <w:rStyle w:val="VerbatimChar"/>
+              </w:rPr>
+              <w:t xml:space="preserve">ingest-ffmpeg-prft</w:t>
+            </w:r>
+          </w:p>
+        </w:tc>
+      </w:tr>
+      <w:tr>
+        <w:tc>
+          <w:tcPr/>
+          <w:p>
+            <w:pPr>
+              <w:pStyle w:val="Compact"/>
+            </w:pPr>
+            <w:r>
+              <w:t xml:space="preserve">C2PA manifest adapter</w:t>
+            </w:r>
+          </w:p>
+        </w:tc>
+        <w:tc>
+          <w:tcPr/>
+          <w:p>
+            <w:pPr>
+              <w:pStyle w:val="Compact"/>
+            </w:pPr>
+            <w:r>
+              <w:rPr>
+                <w:rStyle w:val="VerbatimChar"/>
+              </w:rPr>
+              <w:t xml:space="preserve">adapters/c2pa_manifest.py</w:t>
+            </w:r>
+          </w:p>
+        </w:tc>
+        <w:tc>
+          <w:tcPr/>
+          <w:p>
+            <w:pPr>
+              <w:pStyle w:val="Compact"/>
+            </w:pPr>
+            <w:r>
+              <w:t xml:space="preserve">Manifest ingestion</w:t>
+            </w:r>
+          </w:p>
+        </w:tc>
+        <w:tc>
+          <w:tcPr/>
+          <w:p>
+            <w:pPr>
+              <w:pStyle w:val="Compact"/>
+            </w:pPr>
+            <w:r>
+              <w:rPr>
+                <w:rStyle w:val="VerbatimChar"/>
+              </w:rPr>
+              <w:t xml:space="preserve">ingest-c2pa-manifest</w:t>
+            </w:r>
+          </w:p>
+        </w:tc>
+      </w:tr>
+      <w:tr>
+        <w:tc>
+          <w:tcPr/>
+          <w:p>
+            <w:pPr>
+              <w:pStyle w:val="Compact"/>
+            </w:pPr>
+            <w:r>
+              <w:t xml:space="preserve">Evaluation runner</w:t>
+            </w:r>
+          </w:p>
+        </w:tc>
+        <w:tc>
+          <w:tcPr/>
+          <w:p>
+            <w:pPr>
+              <w:pStyle w:val="Compact"/>
+            </w:pPr>
+            <w:r>
+              <w:rPr>
+                <w:rStyle w:val="VerbatimChar"/>
+              </w:rPr>
+              <w:t xml:space="preserve">media_evaluation.py</w:t>
+            </w:r>
+          </w:p>
+        </w:tc>
+        <w:tc>
+          <w:tcPr/>
+          <w:p>
+            <w:pPr>
+              <w:pStyle w:val="Compact"/>
+            </w:pPr>
+            <w:r>
+              <w:t xml:space="preserve">Evaluation matrices</w:t>
+            </w:r>
+          </w:p>
+        </w:tc>
+        <w:tc>
+          <w:tcPr/>
+          <w:p>
+            <w:pPr>
+              <w:pStyle w:val="Compact"/>
+            </w:pPr>
+            <w:r>
+              <w:rPr>
+                <w:rStyle w:val="VerbatimChar"/>
+              </w:rPr>
+              <w:t xml:space="preserve">run-media-evaluation</w:t>
+            </w:r>
+          </w:p>
+        </w:tc>
+      </w:tr>
+      <w:tr>
+        <w:tc>
+          <w:tcPr/>
+          <w:p>
+            <w:pPr>
+              <w:pStyle w:val="Compact"/>
+            </w:pPr>
+            <w:r>
+              <w:t xml:space="preserve">Release pack builder</w:t>
+            </w:r>
+          </w:p>
+        </w:tc>
+        <w:tc>
+          <w:tcPr/>
+          <w:p>
+            <w:pPr>
+              <w:pStyle w:val="Compact"/>
+            </w:pPr>
+            <w:r>
+              <w:rPr>
+                <w:rStyle w:val="VerbatimChar"/>
+              </w:rPr>
+              <w:t xml:space="preserve">media_release_pack.py</w:t>
+            </w:r>
+          </w:p>
+        </w:tc>
+        <w:tc>
+          <w:tcPr/>
+          <w:p>
+            <w:pPr>
+              <w:pStyle w:val="Compact"/>
+            </w:pPr>
+            <w:r>
+              <w:t xml:space="preserve">Release evidence pack</w:t>
+            </w:r>
+          </w:p>
+        </w:tc>
+        <w:tc>
+          <w:tcPr/>
+          <w:p>
+            <w:pPr>
+              <w:pStyle w:val="Compact"/>
+            </w:pPr>
+            <w:r>
+              <w:rPr>
+                <w:rStyle w:val="VerbatimChar"/>
+              </w:rPr>
+              <w:t xml:space="preserve">build-aep-media-release-pack</w:t>
+            </w:r>
+          </w:p>
+        </w:tc>
+      </w:tr>
+    </w:tbl>
+    <w:p>
+      <w:pPr>
+        <w:pStyle w:val="BodyText"/>
+      </w:pPr>
+      <w:r>
+        <w:t xml:space="preserve">The quickstart path uses only local fixtures:</w:t>
+      </w:r>
+    </w:p>
+    <w:p>
+      <w:pPr>
+        <w:pStyle w:val="SourceCode"/>
       </w:pPr>
       <w:r>
         <w:rPr>
-          <w:rStyle w:val="VerbatimChar"/>
+          <w:rStyle w:val="ExtensionTok"/>
         </w:rPr>
-        <w:t xml:space="preserve">agent_evidence/media_bundle.py</w:t>
-      </w:r>
-      <w:r>
-        <w:t xml:space="preserve">: offline bundle build and verification.</w:t>
-      </w:r>
-    </w:p>
-    <w:p>
-      <w:pPr>
-        <w:pStyle w:val="Compact"/>
-        <w:numPr>
-          <w:ilvl w:val="0"/>
-          <w:numId w:val="1001"/>
-        </w:numPr>
-      </w:pPr>
+        <w:t xml:space="preserve">python</w:t>
+      </w:r>
       <w:r>
         <w:rPr>
-          <w:rStyle w:val="VerbatimChar"/>
+          <w:rStyle w:val="NormalTok"/>
         </w:rPr>
-        <w:t xml:space="preserve">agent_evidence/media_time.py</w:t>
-      </w:r>
-      <w:r>
-        <w:t xml:space="preserve">: strict declared time-trace validation.</w:t>
-      </w:r>
-    </w:p>
-    <w:p>
-      <w:pPr>
-        <w:pStyle w:val="Compact"/>
-        <w:numPr>
-          <w:ilvl w:val="0"/>
-          <w:numId w:val="1001"/>
-        </w:numPr>
-      </w:pPr>
+        <w:t xml:space="preserve"> </w:t>
+      </w:r>
       <w:r>
         <w:rPr>
-          <w:rStyle w:val="VerbatimChar"/>
+          <w:rStyle w:val="AttributeTok"/>
         </w:rPr>
-        <w:t xml:space="preserve">agent_evidence/adapters/linuxptp.py</w:t>
-      </w:r>
-      <w:r>
-        <w:t xml:space="preserve">: LinuxPTP-style trace ingestion.</w:t>
-      </w:r>
-    </w:p>
-    <w:p>
-      <w:pPr>
-        <w:pStyle w:val="Compact"/>
-        <w:numPr>
-          <w:ilvl w:val="0"/>
-          <w:numId w:val="1001"/>
-        </w:numPr>
-      </w:pPr>
+        <w:t xml:space="preserve">-m</w:t>
+      </w:r>
       <w:r>
         <w:rPr>
-          <w:rStyle w:val="VerbatimChar"/>
+          <w:rStyle w:val="NormalTok"/>
         </w:rPr>
-        <w:t xml:space="preserve">agent_evidence/adapters/ffmpeg_prft.py</w:t>
-      </w:r>
-      <w:r>
-        <w:t xml:space="preserve">: FFmpeg PRFT-style metadata ingestion.</w:t>
-      </w:r>
-    </w:p>
-    <w:p>
-      <w:pPr>
-        <w:pStyle w:val="Compact"/>
-        <w:numPr>
-          <w:ilvl w:val="0"/>
-          <w:numId w:val="1001"/>
-        </w:numPr>
-      </w:pPr>
+        <w:t xml:space="preserve"> pip install </w:t>
+      </w:r>
       <w:r>
         <w:rPr>
-          <w:rStyle w:val="VerbatimChar"/>
+          <w:rStyle w:val="AttributeTok"/>
         </w:rPr>
-        <w:t xml:space="preserve">agent_evidence/adapters/c2pa_manifest.py</w:t>
-      </w:r>
-      <w:r>
-        <w:t xml:space="preserve">: C2PA-like manifest ingestion.</w:t>
-      </w:r>
-    </w:p>
-    <w:p>
-      <w:pPr>
-        <w:pStyle w:val="Compact"/>
-        <w:numPr>
-          <w:ilvl w:val="0"/>
-          <w:numId w:val="1001"/>
-        </w:numPr>
-      </w:pPr>
+        <w:t xml:space="preserve">-e</w:t>
+      </w:r>
       <w:r>
         <w:rPr>
-          <w:rStyle w:val="VerbatimChar"/>
+          <w:rStyle w:val="NormalTok"/>
         </w:rPr>
-        <w:t xml:space="preserve">agent_evidence/media_evaluation.py</w:t>
-      </w:r>
-      <w:r>
-        <w:t xml:space="preserve">: default evaluation matrix.</w:t>
-      </w:r>
-    </w:p>
-    <w:p>
-      <w:pPr>
-        <w:pStyle w:val="Compact"/>
-        <w:numPr>
-          <w:ilvl w:val="0"/>
-          <w:numId w:val="1001"/>
-        </w:numPr>
-      </w:pPr>
-      <w:r>
-        <w:rPr>
-          <w:rStyle w:val="VerbatimChar"/>
-        </w:rPr>
-        <w:t xml:space="preserve">agent_evidence/media_adapter_evaluation.py</w:t>
-      </w:r>
-      <w:r>
-        <w:t xml:space="preserve">: adapter-inclusive evaluation.</w:t>
-      </w:r>
-    </w:p>
-    <w:p>
-      <w:pPr>
-        <w:pStyle w:val="Compact"/>
-        <w:numPr>
-          <w:ilvl w:val="0"/>
-          <w:numId w:val="1001"/>
-        </w:numPr>
-      </w:pPr>
-      <w:r>
-        <w:rPr>
-          <w:rStyle w:val="VerbatimChar"/>
-        </w:rPr>
-        <w:t xml:space="preserve">agent_evidence/media_optional_tools.py</w:t>
-      </w:r>
-      <w:r>
-        <w:t xml:space="preserve">: optional external-tool reporting.</w:t>
-      </w:r>
-    </w:p>
-    <w:p>
-      <w:pPr>
-        <w:pStyle w:val="Compact"/>
-        <w:numPr>
-          <w:ilvl w:val="0"/>
-          <w:numId w:val="1001"/>
-        </w:numPr>
-      </w:pPr>
-      <w:r>
-        <w:rPr>
-          <w:rStyle w:val="VerbatimChar"/>
-        </w:rPr>
-        <w:t xml:space="preserve">agent_evidence/media_release_pack.py</w:t>
-      </w:r>
-      <w:r>
-        <w:t xml:space="preserve">: release pack assembly.</w:t>
-      </w:r>
-    </w:p>
-    <w:bookmarkEnd w:id="37"/>
-    <w:bookmarkStart w:id="38" w:name="illustrative-examples"/>
-    <w:p>
-      <w:pPr>
-        <w:pStyle w:val="Heading2"/>
-      </w:pPr>
-      <w:r>
-        <w:t xml:space="preserve">3. Illustrative examples</w:t>
-      </w:r>
-    </w:p>
-    <w:p>
-      <w:pPr>
-        <w:pStyle w:val="FirstParagraph"/>
-      </w:pPr>
-      <w:r>
-        <w:t xml:space="preserve">A typical profile validation run is:</w:t>
-      </w:r>
-    </w:p>
-    <w:p>
-      <w:pPr>
-        <w:pStyle w:val="SourceCode"/>
-      </w:pPr>
+        <w:t xml:space="preserve"> .</w:t>
+      </w:r>
+      <w:r>
+        <w:br/>
+      </w:r>
       <w:r>
         <w:rPr>
           <w:rStyle w:val="ExtensionTok"/>
@@ -833,6 +1590,27 @@
         <w:rPr>
           <w:rStyle w:val="NormalTok"/>
         </w:rPr>
+        <w:t xml:space="preserve"> </w:t>
+      </w:r>
+      <w:r>
+        <w:rPr>
+          <w:rStyle w:val="AttributeTok"/>
+        </w:rPr>
+        <w:t xml:space="preserve">--help</w:t>
+      </w:r>
+      <w:r>
+        <w:br/>
+      </w:r>
+      <w:r>
+        <w:rPr>
+          <w:rStyle w:val="ExtensionTok"/>
+        </w:rPr>
+        <w:t xml:space="preserve">agent-evidence</w:t>
+      </w:r>
+      <w:r>
+        <w:rPr>
+          <w:rStyle w:val="NormalTok"/>
+        </w:rPr>
         <w:t xml:space="preserve"> validate-media-profile </w:t>
       </w:r>
       <w:r>
@@ -850,19 +1628,9 @@
         </w:rPr>
         <w:t xml:space="preserve">  examples/media/minimal-valid-media-evidence.json</w:t>
       </w:r>
-    </w:p>
-    <w:p>
-      <w:pPr>
-        <w:pStyle w:val="FirstParagraph"/>
-      </w:pPr>
-      <w:r>
-        <w:t xml:space="preserve">A minimal offline bundle workflow is:</w:t>
-      </w:r>
-    </w:p>
-    <w:p>
-      <w:pPr>
-        <w:pStyle w:val="SourceCode"/>
-      </w:pPr>
+      <w:r>
+        <w:br/>
+      </w:r>
       <w:r>
         <w:rPr>
           <w:rStyle w:val="ExtensionTok"/>
@@ -921,9 +1689,6 @@
         <w:br/>
       </w:r>
       <w:r>
-        <w:br/>
-      </w:r>
-      <w:r>
         <w:rPr>
           <w:rStyle w:val="ExtensionTok"/>
         </w:rPr>
@@ -933,7 +1698,22 @@
         <w:rPr>
           <w:rStyle w:val="NormalTok"/>
         </w:rPr>
-        <w:t xml:space="preserve"> verify-media-bundle </w:t>
+        <w:t xml:space="preserve"> verify-media-bundle /tmp/aep-media-bundle-check</w:t>
+      </w:r>
+      <w:r>
+        <w:br/>
+      </w:r>
+      <w:r>
+        <w:rPr>
+          <w:rStyle w:val="ExtensionTok"/>
+        </w:rPr>
+        <w:t xml:space="preserve">agent-evidence</w:t>
+      </w:r>
+      <w:r>
+        <w:rPr>
+          <w:rStyle w:val="NormalTok"/>
+        </w:rPr>
+        <w:t xml:space="preserve"> validate-media-time-profile </w:t>
       </w:r>
       <w:r>
         <w:rPr>
@@ -948,21 +1728,11 @@
         <w:rPr>
           <w:rStyle w:val="NormalTok"/>
         </w:rPr>
-        <w:t xml:space="preserve">  /tmp/aep-media-bundle-check</w:t>
-      </w:r>
-    </w:p>
-    <w:p>
-      <w:pPr>
-        <w:pStyle w:val="FirstParagraph"/>
-      </w:pPr>
-      <w:r>
-        <w:t xml:space="preserve">A strict-time validation run is:</w:t>
-      </w:r>
-    </w:p>
-    <w:p>
-      <w:pPr>
-        <w:pStyle w:val="SourceCode"/>
-      </w:pPr>
+        <w:t xml:space="preserve">  examples/media/time/minimal-valid-time-aware-media-evidence.json</w:t>
+      </w:r>
+      <w:r>
+        <w:br/>
+      </w:r>
       <w:r>
         <w:rPr>
           <w:rStyle w:val="ExtensionTok"/>
@@ -973,62 +1743,7 @@
         <w:rPr>
           <w:rStyle w:val="NormalTok"/>
         </w:rPr>
-        <w:t xml:space="preserve"> validate-media-time-profile </w:t>
-      </w:r>
-      <w:r>
-        <w:rPr>
-          <w:rStyle w:val="DataTypeTok"/>
-        </w:rPr>
-        <w:t xml:space="preserve">\</w:t>
-      </w:r>
-      <w:r>
-        <w:br/>
-      </w:r>
-      <w:r>
-        <w:rPr>
-          <w:rStyle w:val="NormalTok"/>
-        </w:rPr>
-        <w:t xml:space="preserve">  examples/media/time/minimal-valid-time-aware-media-evidence.json</w:t>
-      </w:r>
-    </w:p>
-    <w:p>
-      <w:pPr>
-        <w:pStyle w:val="FirstParagraph"/>
-      </w:pPr>
-      <w:r>
-        <w:t xml:space="preserve">The evaluation matrix can be reproduced with:</w:t>
-      </w:r>
-    </w:p>
-    <w:p>
-      <w:pPr>
-        <w:pStyle w:val="SourceCode"/>
-      </w:pPr>
-      <w:r>
-        <w:rPr>
-          <w:rStyle w:val="ExtensionTok"/>
-        </w:rPr>
-        <w:t xml:space="preserve">agent-evidence</w:t>
-      </w:r>
-      <w:r>
-        <w:rPr>
-          <w:rStyle w:val="NormalTok"/>
-        </w:rPr>
         <w:t xml:space="preserve"> run-media-evaluation </w:t>
-      </w:r>
-      <w:r>
-        <w:rPr>
-          <w:rStyle w:val="DataTypeTok"/>
-        </w:rPr>
-        <w:t xml:space="preserve">\</w:t>
-      </w:r>
-      <w:r>
-        <w:br/>
-      </w:r>
-      <w:r>
-        <w:rPr>
-          <w:rStyle w:val="NormalTok"/>
-        </w:rPr>
-        <w:t xml:space="preserve">  </w:t>
       </w:r>
       <w:r>
         <w:rPr>
@@ -1048,32 +1763,17 @@
         <w:pStyle w:val="FirstParagraph"/>
       </w:pPr>
       <w:r>
-        <w:t xml:space="preserve">The repository includes valid examples, controlled invalid examples, strict-time fixtures, adapter fixtures, and tamper cases. These allow researchers to reproduce the intended pass/fail behavior without installing LinuxPTP, FFmpeg, ffprobe, or C2PA. The archived software release is available from Zenodo as version</w:t>
-      </w:r>
-      <w:r>
-        <w:t xml:space="preserve"> </w:t>
-      </w:r>
-      <w:r>
-        <w:rPr>
-          <w:rStyle w:val="VerbatimChar"/>
-        </w:rPr>
-        <w:t xml:space="preserve">aep-media-v0.1.0</w:t>
-      </w:r>
-      <w:r>
-        <w:t xml:space="preserve"> </w:t>
-      </w:r>
-      <w:r>
-        <w:t xml:space="preserve">[9].</w:t>
-      </w:r>
-    </w:p>
-    <w:bookmarkEnd w:id="38"/>
-    <w:bookmarkStart w:id="39" w:name="impact"/>
+        <w:t xml:space="preserve">The implementation relies on structured JSON validation and release packaging practices that are aligned with JSON Schema validation [9,10] and reproducible artifact review expectations [11].</w:t>
+      </w:r>
+    </w:p>
+    <w:bookmarkEnd w:id="41"/>
+    <w:bookmarkStart w:id="42" w:name="reproducibility-and-evaluation"/>
     <w:p>
       <w:pPr>
         <w:pStyle w:val="Heading2"/>
       </w:pPr>
       <w:r>
-        <w:t xml:space="preserve">4. Impact</w:t>
+        <w:t xml:space="preserve">3. Reproducibility and evaluation</w:t>
       </w:r>
     </w:p>
     <w:p>
@@ -1081,7 +1781,7 @@
         <w:pStyle w:val="FirstParagraph"/>
       </w:pPr>
       <w:r>
-        <w:t xml:space="preserve">AEP-Media supports research on operation accountability, media evidence packaging, provenance boundaries, and reproducible validation artifacts. It gives researchers a concrete software artifact for asking whether a declared media evidence package is internally consistent and portable. This is useful for experiments that need a stable evidence-object representation rather than ad hoc media files and logs.</w:t>
+        <w:t xml:space="preserve">AEP-Media is evaluated as a conformance-oriented research software artifact. The evaluation checks whether valid cases pass, invalid and tamper cases fail with expected codes, adapter ingestion remains claim-bounded, and optional-tool absence is reported rather than hidden. It is not a field-deployment benchmark.</w:t>
       </w:r>
     </w:p>
     <w:p>
@@ -1089,7 +1789,55 @@
         <w:pStyle w:val="BodyText"/>
       </w:pPr>
       <w:r>
-        <w:t xml:space="preserve">The evaluation is conformance-oriented. Prior release reports record 18 default cases, 26 adapter-inclusive cases, 23 optional-tool reporting cases, and 31 combined adapter/optional-tool cases, all with</w:t>
+        <w:t xml:space="preserve">For the AEP-Media v0.1.0 release, the final validation run reports:</w:t>
+      </w:r>
+    </w:p>
+    <w:p>
+      <w:pPr>
+        <w:pStyle w:val="Compact"/>
+        <w:numPr>
+          <w:ilvl w:val="0"/>
+          <w:numId w:val="1002"/>
+        </w:numPr>
+      </w:pPr>
+      <w:r>
+        <w:t xml:space="preserve">targeted AEP-Media tests: 48 passed, 1 warning;</w:t>
+      </w:r>
+    </w:p>
+    <w:p>
+      <w:pPr>
+        <w:pStyle w:val="Compact"/>
+        <w:numPr>
+          <w:ilvl w:val="0"/>
+          <w:numId w:val="1002"/>
+        </w:numPr>
+      </w:pPr>
+      <w:r>
+        <w:t xml:space="preserve">SoftwareX/readiness tests: 23 passed, 1 warning;</w:t>
+      </w:r>
+    </w:p>
+    <w:p>
+      <w:pPr>
+        <w:pStyle w:val="Compact"/>
+        <w:numPr>
+          <w:ilvl w:val="0"/>
+          <w:numId w:val="1002"/>
+        </w:numPr>
+      </w:pPr>
+      <w:r>
+        <w:t xml:space="preserve">full test suite: 155 passed, 1 skipped, 15 warnings;</w:t>
+      </w:r>
+    </w:p>
+    <w:p>
+      <w:pPr>
+        <w:pStyle w:val="Compact"/>
+        <w:numPr>
+          <w:ilvl w:val="0"/>
+          <w:numId w:val="1002"/>
+        </w:numPr>
+      </w:pPr>
+      <w:r>
+        <w:t xml:space="preserve">default evaluation: 18 cases,</w:t>
       </w:r>
       <w:r>
         <w:t xml:space="preserve"> </w:t>
@@ -1101,67 +1849,19 @@
         <w:t xml:space="preserve">unexpected=0</w:t>
       </w:r>
       <w:r>
-        <w:t xml:space="preserve">. The case categories include valid conformance cases, invalid single-rule cases, bundle tamper cases, strict-time failures, adapter-ingestion cases, and optional-tool reporting cases. Expected failures include missing time context, media hash mismatch, unresolved policy reference, bundle checksum mismatch, path escape, missing clock-trace reference, clock offset threshold exceedance, clock window mismatch, missing PRFT metadata, and declared invalid C2PA-like signature status.</w:t>
-      </w:r>
-    </w:p>
-    <w:p>
-      <w:pPr>
-        <w:pStyle w:val="BodyText"/>
-      </w:pPr>
-      <w:r>
-        <w:t xml:space="preserve">The impact is not that AEP-Media proves authenticity. Its value is that it makes the local evidence object explicit and reproducibly checkable, which is a prerequisite for stronger assurance layers. Researchers can use it as a baseline when comparing provenance models, evidence-package formats, adapter boundaries, or future external-verification appendices. The implementation also complements supply-chain and attestation systems such as in-toto and SLSA by focusing on media-bearing operation evidence rather than build provenance alone [10,11].</w:t>
-      </w:r>
-    </w:p>
-    <w:bookmarkEnd w:id="39"/>
-    <w:bookmarkStart w:id="40" w:name="conclusions"/>
-    <w:p>
-      <w:pPr>
-        <w:pStyle w:val="Heading2"/>
-      </w:pPr>
-      <w:r>
-        <w:t xml:space="preserve">5. Conclusions</w:t>
-      </w:r>
-    </w:p>
-    <w:p>
-      <w:pPr>
-        <w:pStyle w:val="FirstParagraph"/>
-      </w:pPr>
-      <w:r>
-        <w:t xml:space="preserve">AEP-Media is reusable research software for offline validation of time-aware media evidence bundles. It combines a small profile, schemas, examples, command-line validators, bundle verification, strict declared time-trace validation, adapter-only ingestion, reproducible evaluation matrices, and release packaging material.</w:t>
-      </w:r>
-    </w:p>
-    <w:p>
-      <w:pPr>
-        <w:pStyle w:val="BodyText"/>
-      </w:pPr>
-      <w:r>
-        <w:t xml:space="preserve">The current claim is local validation and fixture-based adapter ingestion. AEP-Media detects inconsistencies inside a declared evidence package, but it does not establish that the original media capture event was truthful, authorized, or unmodified before packaging. It does not provide legal admissibility, non-repudiation, trusted timestamping, real PTP proof, full MP4 PRFT parsing, real C2PA signature verification, chain of custody, production deployment, or broad forensic sufficiency.</w:t>
-      </w:r>
-    </w:p>
-    <w:p>
-      <w:pPr>
-        <w:pStyle w:val="BodyText"/>
-      </w:pPr>
-      <w:r>
-        <w:t xml:space="preserve">Future work should keep the local profile semantics stable while adding environment-specific evidence appendices: LinuxPTP traces captured on equipped Linux hosts, ffprobe output from PRFT-bearing media, C2PA CLI reports for real signed assets, and independent reproduction of the evaluation matrix.</w:t>
-      </w:r>
-    </w:p>
-    <w:bookmarkEnd w:id="40"/>
-    <w:bookmarkStart w:id="41" w:name="data-availability"/>
-    <w:p>
-      <w:pPr>
-        <w:pStyle w:val="Heading2"/>
-      </w:pPr>
-      <w:r>
-        <w:t xml:space="preserve">Data availability</w:t>
-      </w:r>
-    </w:p>
-    <w:p>
-      <w:pPr>
-        <w:pStyle w:val="FirstParagraph"/>
-      </w:pPr>
-      <w:r>
-        <w:t xml:space="preserve">The software, selected examples, schemas, reports, and release materials are available in the public GitHub repository at</w:t>
+        <w:t xml:space="preserve">;</w:t>
+      </w:r>
+    </w:p>
+    <w:p>
+      <w:pPr>
+        <w:pStyle w:val="Compact"/>
+        <w:numPr>
+          <w:ilvl w:val="0"/>
+          <w:numId w:val="1002"/>
+        </w:numPr>
+      </w:pPr>
+      <w:r>
+        <w:t xml:space="preserve">adapter-inclusive evaluation: 26 cases,</w:t>
       </w:r>
       <w:r>
         <w:t xml:space="preserve"> </w:t>
@@ -1170,13 +1870,22 @@
         <w:rPr>
           <w:rStyle w:val="VerbatimChar"/>
         </w:rPr>
-        <w:t xml:space="preserve">https://github.com/joy7758/agent-evidence</w:t>
-      </w:r>
-      <w:r>
-        <w:t xml:space="preserve"> </w:t>
-      </w:r>
-      <w:r>
-        <w:t xml:space="preserve">and in the Zenodo archive for AEP-Media v0.1.0 at</w:t>
+        <w:t xml:space="preserve">unexpected=0</w:t>
+      </w:r>
+      <w:r>
+        <w:t xml:space="preserve">;</w:t>
+      </w:r>
+    </w:p>
+    <w:p>
+      <w:pPr>
+        <w:pStyle w:val="Compact"/>
+        <w:numPr>
+          <w:ilvl w:val="0"/>
+          <w:numId w:val="1002"/>
+        </w:numPr>
+      </w:pPr>
+      <w:r>
+        <w:t xml:space="preserve">optional-tool reporting evaluation: 23 cases,</w:t>
       </w:r>
       <w:r>
         <w:t xml:space="preserve"> </w:t>
@@ -1185,20 +1894,96 @@
         <w:rPr>
           <w:rStyle w:val="VerbatimChar"/>
         </w:rPr>
-        <w:t xml:space="preserve">https://doi.org/10.5281/zenodo.20107097</w:t>
-      </w:r>
-      <w:r>
-        <w:t xml:space="preserve">. The supplementary package accompanying this submission contains selected schemas, examples, reproducibility commands, evaluation summaries, and claim-boundary documentation.</w:t>
-      </w:r>
-    </w:p>
-    <w:bookmarkEnd w:id="41"/>
-    <w:bookmarkStart w:id="42" w:name="credit-authorship-contribution-statement"/>
+        <w:t xml:space="preserve">unexpected=0</w:t>
+      </w:r>
+      <w:r>
+        <w:t xml:space="preserve">;</w:t>
+      </w:r>
+    </w:p>
+    <w:p>
+      <w:pPr>
+        <w:pStyle w:val="Compact"/>
+        <w:numPr>
+          <w:ilvl w:val="0"/>
+          <w:numId w:val="1002"/>
+        </w:numPr>
+      </w:pPr>
+      <w:r>
+        <w:t xml:space="preserve">combined adapter and optional-tool evaluation: 31 cases,</w:t>
+      </w:r>
+      <w:r>
+        <w:t xml:space="preserve"> </w:t>
+      </w:r>
+      <w:r>
+        <w:rPr>
+          <w:rStyle w:val="VerbatimChar"/>
+        </w:rPr>
+        <w:t xml:space="preserve">unexpected=0</w:t>
+      </w:r>
+      <w:r>
+        <w:t xml:space="preserve">;</w:t>
+      </w:r>
+    </w:p>
+    <w:p>
+      <w:pPr>
+        <w:pStyle w:val="Compact"/>
+        <w:numPr>
+          <w:ilvl w:val="0"/>
+          <w:numId w:val="1002"/>
+        </w:numPr>
+      </w:pPr>
+      <w:r>
+        <w:t xml:space="preserve">release pack:</w:t>
+      </w:r>
+      <w:r>
+        <w:t xml:space="preserve"> </w:t>
+      </w:r>
+      <w:r>
+        <w:rPr>
+          <w:rStyle w:val="VerbatimChar"/>
+        </w:rPr>
+        <w:t xml:space="preserve">PASS aep-media-release-pack@0.1</w:t>
+      </w:r>
+      <w:r>
+        <w:t xml:space="preserve">.</w:t>
+      </w:r>
+    </w:p>
+    <w:p>
+      <w:pPr>
+        <w:pStyle w:val="FirstParagraph"/>
+      </w:pPr>
+      <w:r>
+        <w:t xml:space="preserve">The case categories include valid conformance cases, invalid single-rule cases, bundle tamper cases, strict-time failures, adapter-ingestion cases, and optional-tool reporting cases. Expected failures include missing time context, media hash mismatch, unresolved policy reference, bundle checksum mismatch, path escape, missing clock-trace reference, clock offset threshold exceedance, clock window mismatch, missing PRFT metadata, and declared invalid C2PA-like signature status.</w:t>
+      </w:r>
+    </w:p>
+    <w:p>
+      <w:pPr>
+        <w:pStyle w:val="BodyText"/>
+      </w:pPr>
+      <w:r>
+        <w:t xml:space="preserve">The supplementary material,</w:t>
+      </w:r>
+      <w:r>
+        <w:t xml:space="preserve"> </w:t>
+      </w:r>
+      <w:r>
+        <w:rPr>
+          <w:rStyle w:val="VerbatimChar"/>
+        </w:rPr>
+        <w:t xml:space="preserve">AEP-Media_SoftwareX_Supplementary.zip</w:t>
+      </w:r>
+      <w:r>
+        <w:t xml:space="preserve">, contains reproducibility notes, the claim-boundary statement, software inventory, selected schemas, selected examples, evaluation summaries, checksums, and generated reports used to support the release-level validation described in this paper.</w:t>
+      </w:r>
+    </w:p>
+    <w:bookmarkEnd w:id="42"/>
+    <w:bookmarkStart w:id="43" w:name="impact"/>
     <w:p>
       <w:pPr>
         <w:pStyle w:val="Heading2"/>
       </w:pPr>
       <w:r>
-        <w:t xml:space="preserve">CRediT authorship contribution statement</w:t>
+        <w:t xml:space="preserve">4. Impact</w:t>
       </w:r>
     </w:p>
     <w:p>
@@ -1206,11 +1991,81 @@
         <w:pStyle w:val="FirstParagraph"/>
       </w:pPr>
       <w:r>
+        <w:t xml:space="preserve">AEP-Media can be reused by three groups. First, researchers studying media evidence packaging, provenance boundaries, and operation accountability can use it as a concrete evidence-object baseline. Second, developers building validation fixtures for media-bearing AI, robotics, simulation, or audit-oriented workflows can reuse the schemas, examples, CLI commands, and pass/fail matrices. Third, reviewers can use the release package to check hashes, references, bundle safety, and declared time traces before stronger external assurance layers are added.</w:t>
+      </w:r>
+    </w:p>
+    <w:p>
+      <w:pPr>
+        <w:pStyle w:val="BodyText"/>
+      </w:pPr>
+      <w:r>
+        <w:t xml:space="preserve">The impact is not that AEP-Media proves authenticity. Its value is that it makes the local evidence object explicit and reproducibly checkable, providing a stable baseline for future real PTP, PRFT, C2PA, signing, or trusted timestamping appendices. The software also complements supply-chain and attestation systems such as in-toto and SLSA [12,13] by focusing on media-bearing operation evidence rather than build provenance alone. Its evidence-object orientation is also consistent with broader digital-object thinking in which durable identifiers, metadata, and reviewable object boundaries matter for reuse [14,15].</w:t>
+      </w:r>
+    </w:p>
+    <w:bookmarkEnd w:id="43"/>
+    <w:bookmarkStart w:id="44" w:name="limitations-and-claim-boundary"/>
+    <w:p>
+      <w:pPr>
+        <w:pStyle w:val="Heading2"/>
+      </w:pPr>
+      <w:r>
+        <w:t xml:space="preserve">5. Limitations and claim boundary</w:t>
+      </w:r>
+    </w:p>
+    <w:p>
+      <w:pPr>
+        <w:pStyle w:val="FirstParagraph"/>
+      </w:pPr>
+      <w:r>
+        <w:t xml:space="preserve">AEP-Media detects inconsistencies inside a declared evidence package, but it does not establish that the original media capture event was truthful, authorized, or unmodified before packaging. It makes no claims of legal admissibility, non-repudiation, trusted timestamping, real PTP proof, full MP4 PRFT parser coverage, real C2PA signature verification, chain of custody, production deployment, or broad forensic sufficiency.</w:t>
+      </w:r>
+    </w:p>
+    <w:p>
+      <w:pPr>
+        <w:pStyle w:val="BodyText"/>
+      </w:pPr>
+      <w:r>
+        <w:t xml:space="preserve">Optional external-tool paths are reporting paths. The reproducible baseline remains local validation and fixture-based adapter ingestion. Future work should keep the local profile semantics stable while adding environment-specific evidence appendices: LinuxPTP traces captured on equipped Linux hosts, ffprobe output from PRFT-bearing media, C2PA CLI reports for real signed assets, and independent reproduction of the evaluation matrix.</w:t>
+      </w:r>
+    </w:p>
+    <w:bookmarkEnd w:id="44"/>
+    <w:bookmarkStart w:id="45" w:name="conclusions"/>
+    <w:p>
+      <w:pPr>
+        <w:pStyle w:val="Heading2"/>
+      </w:pPr>
+      <w:r>
+        <w:t xml:space="preserve">6. Conclusions</w:t>
+      </w:r>
+    </w:p>
+    <w:p>
+      <w:pPr>
+        <w:pStyle w:val="FirstParagraph"/>
+      </w:pPr>
+      <w:r>
+        <w:t xml:space="preserve">AEP-Media is reusable research software for offline validation of time-aware media evidence bundles. It combines a small profile, schemas, examples, command-line validators, bundle verification, strict declared time-trace validation, adapter-only ingestion, reproducible evaluation matrices, a release archive, and supplementary review material. The v0.1.0 release provides a citable baseline for researchers who need local media-evidence validation before pursuing stronger environment-dependent assurance.</w:t>
+      </w:r>
+    </w:p>
+    <w:bookmarkEnd w:id="45"/>
+    <w:bookmarkStart w:id="46" w:name="credit-author-statement"/>
+    <w:p>
+      <w:pPr>
+        <w:pStyle w:val="Heading2"/>
+      </w:pPr>
+      <w:r>
+        <w:t xml:space="preserve">CRediT author statement</w:t>
+      </w:r>
+    </w:p>
+    <w:p>
+      <w:pPr>
+        <w:pStyle w:val="FirstParagraph"/>
+      </w:pPr>
+      <w:r>
         <w:t xml:space="preserve">Bin Zhang: Conceptualization, Methodology, Software, Validation, Investigation, Data curation, Writing - original draft, Writing - review and editing, Project administration.</w:t>
       </w:r>
     </w:p>
-    <w:bookmarkEnd w:id="42"/>
-    <w:bookmarkStart w:id="43" w:name="declaration-of-competing-interest"/>
+    <w:bookmarkEnd w:id="46"/>
+    <w:bookmarkStart w:id="47" w:name="declaration-of-competing-interest"/>
     <w:p>
       <w:pPr>
         <w:pStyle w:val="Heading2"/>
@@ -1224,11 +2079,11 @@
         <w:pStyle w:val="FirstParagraph"/>
       </w:pPr>
       <w:r>
-        <w:t xml:space="preserve">The author declares no known competing financial interests or personal relationships that could have appeared to influence the work reported in this article.</w:t>
-      </w:r>
-    </w:p>
-    <w:bookmarkEnd w:id="43"/>
-    <w:bookmarkStart w:id="44" w:name="funding"/>
+        <w:t xml:space="preserve">The author declares no known competing financial interests or personal relationships that could have appeared to influence the work.</w:t>
+      </w:r>
+    </w:p>
+    <w:bookmarkEnd w:id="47"/>
+    <w:bookmarkStart w:id="48" w:name="funding"/>
     <w:p>
       <w:pPr>
         <w:pStyle w:val="Heading2"/>
@@ -1245,13 +2100,31 @@
         <w:t xml:space="preserve">No specific funding was received for this work.</w:t>
       </w:r>
     </w:p>
-    <w:bookmarkEnd w:id="44"/>
-    <w:bookmarkStart w:id="45" w:name="X1f74eb43af444059c7518034463b6c89b1cacf4"/>
+    <w:bookmarkEnd w:id="48"/>
+    <w:bookmarkStart w:id="49" w:name="data-and-software-availability"/>
     <w:p>
       <w:pPr>
         <w:pStyle w:val="Heading2"/>
       </w:pPr>
       <w:r>
+        <w:t xml:space="preserve">Data and software availability</w:t>
+      </w:r>
+    </w:p>
+    <w:p>
+      <w:pPr>
+        <w:pStyle w:val="FirstParagraph"/>
+      </w:pPr>
+      <w:r>
+        <w:t xml:space="preserve">No separate dataset was used. The software, schemas, examples, reproducibility materials, release archive, and supplementary package are available through the GitHub repository, GitHub release, Zenodo archive, and submitted supplementary material.</w:t>
+      </w:r>
+    </w:p>
+    <w:bookmarkEnd w:id="49"/>
+    <w:bookmarkStart w:id="50" w:name="X1f74eb43af444059c7518034463b6c89b1cacf4"/>
+    <w:p>
+      <w:pPr>
+        <w:pStyle w:val="Heading2"/>
+      </w:pPr>
+      <w:r>
         <w:t xml:space="preserve">Declaration of generative AI and AI-assisted technologies in the manuscript preparation process</w:t>
       </w:r>
     </w:p>
@@ -1260,11 +2133,11 @@
         <w:pStyle w:val="FirstParagraph"/>
       </w:pPr>
       <w:r>
-        <w:t xml:space="preserve">During the preparation of this work, the author used OpenAI ChatGPT/Codex for manuscript organization, implementation scaffolding, command generation, and wording refinement. After using these tools, the author reviewed and edited the content as needed and takes full responsibility for the content of the submitted article.</w:t>
-      </w:r>
-    </w:p>
-    <w:bookmarkEnd w:id="45"/>
-    <w:bookmarkStart w:id="57" w:name="references"/>
+        <w:t xml:space="preserve">The author used OpenAI ChatGPT/Codex for manuscript organization, implementation scaffolding, command generation, and wording refinement. After using these tools, the author reviewed and edited the content as needed and takes full responsibility for the content of the submitted article.</w:t>
+      </w:r>
+    </w:p>
+    <w:bookmarkEnd w:id="50"/>
+    <w:bookmarkStart w:id="65" w:name="references"/>
     <w:p>
       <w:pPr>
         <w:pStyle w:val="Heading2"/>
@@ -1278,12 +2151,12 @@
         <w:pStyle w:val="FirstParagraph"/>
       </w:pPr>
       <w:r>
-        <w:t xml:space="preserve">[1] W3C. PROV Overview. World Wide Web Consortium.</w:t>
+        <w:t xml:space="preserve">[1] W3C. PROV-Overview: An Overview of the PROV Family of Documents. W3C Working Group Note; 2013. Available:</w:t>
       </w:r>
       <w:r>
         <w:t xml:space="preserve"> </w:t>
       </w:r>
-      <w:hyperlink r:id="rId46">
+      <w:hyperlink r:id="rId51">
         <w:r>
           <w:rPr>
             <w:rStyle w:val="Hyperlink"/>
@@ -1292,7 +2165,7 @@
         </w:r>
       </w:hyperlink>
       <w:r>
-        <w:t xml:space="preserve">; 2013 [accessed 10 May 2026].</w:t>
+        <w:t xml:space="preserve">.</w:t>
       </w:r>
     </w:p>
     <w:p>
@@ -1300,12 +2173,12 @@
         <w:pStyle w:val="BodyText"/>
       </w:pPr>
       <w:r>
-        <w:t xml:space="preserve">[2] W3C. PROV-DM: The PROV Data Model. World Wide Web Consortium.</w:t>
+        <w:t xml:space="preserve">[2] Moreau L, Missier P. PROV-DM: The PROV Data Model. W3C Recommendation; 2013. Available:</w:t>
       </w:r>
       <w:r>
         <w:t xml:space="preserve"> </w:t>
       </w:r>
-      <w:hyperlink r:id="rId47">
+      <w:hyperlink r:id="rId52">
         <w:r>
           <w:rPr>
             <w:rStyle w:val="Hyperlink"/>
@@ -1314,7 +2187,7 @@
         </w:r>
       </w:hyperlink>
       <w:r>
-        <w:t xml:space="preserve">; 2013 [accessed 10 May 2026].</w:t>
+        <w:t xml:space="preserve">.</w:t>
       </w:r>
     </w:p>
     <w:p>
@@ -1322,21 +2195,21 @@
         <w:pStyle w:val="BodyText"/>
       </w:pPr>
       <w:r>
-        <w:t xml:space="preserve">[3] Coalition for Content Provenance and Authenticity. C2PA Technical Specification.</w:t>
+        <w:t xml:space="preserve">[3] Coalition for Content Provenance and Authenticity. C2PA Technical Specification. Available:</w:t>
       </w:r>
       <w:r>
         <w:t xml:space="preserve"> </w:t>
       </w:r>
-      <w:hyperlink r:id="rId48">
+      <w:hyperlink r:id="rId53">
         <w:r>
           <w:rPr>
             <w:rStyle w:val="Hyperlink"/>
           </w:rPr>
-          <w:t xml:space="preserve">https://c2pa.org/specifications/</w:t>
+          <w:t xml:space="preserve">https://spec.c2pa.org/</w:t>
         </w:r>
       </w:hyperlink>
       <w:r>
-        <w:t xml:space="preserve">; 2024 [accessed 10 May 2026].</w:t>
+        <w:t xml:space="preserve">.</w:t>
       </w:r>
     </w:p>
     <w:p>
@@ -1344,12 +2217,12 @@
         <w:pStyle w:val="BodyText"/>
       </w:pPr>
       <w:r>
-        <w:t xml:space="preserve">[4] FFmpeg Project. ffprobe Documentation.</w:t>
+        <w:t xml:space="preserve">[4] FFmpeg Project. ffprobe Documentation. Available:</w:t>
       </w:r>
       <w:r>
         <w:t xml:space="preserve"> </w:t>
       </w:r>
-      <w:hyperlink r:id="rId49">
+      <w:hyperlink r:id="rId54">
         <w:r>
           <w:rPr>
             <w:rStyle w:val="Hyperlink"/>
@@ -1358,7 +2231,7 @@
         </w:r>
       </w:hyperlink>
       <w:r>
-        <w:t xml:space="preserve">; 2026 [accessed 10 May 2026].</w:t>
+        <w:t xml:space="preserve">.</w:t>
       </w:r>
     </w:p>
     <w:p>
@@ -1366,21 +2239,21 @@
         <w:pStyle w:val="BodyText"/>
       </w:pPr>
       <w:r>
-        <w:t xml:space="preserve">[5] LinuxPTP Project. ptp4l and phc2sys Documentation.</w:t>
+        <w:t xml:space="preserve">[5] FFmpeg Project. FFmpeg Formats Documentation. Available:</w:t>
       </w:r>
       <w:r>
         <w:t xml:space="preserve"> </w:t>
       </w:r>
-      <w:hyperlink r:id="rId50">
+      <w:hyperlink r:id="rId55">
         <w:r>
           <w:rPr>
             <w:rStyle w:val="Hyperlink"/>
           </w:rPr>
-          <w:t xml:space="preserve">https://linuxptp.sourceforge.net/</w:t>
+          <w:t xml:space="preserve">https://ffmpeg.org/ffmpeg-formats.html</w:t>
         </w:r>
       </w:hyperlink>
       <w:r>
-        <w:t xml:space="preserve">; 2026 [accessed 10 May 2026].</w:t>
+        <w:t xml:space="preserve">.</w:t>
       </w:r>
     </w:p>
     <w:p>
@@ -1388,12 +2261,56 @@
         <w:pStyle w:val="BodyText"/>
       </w:pPr>
       <w:r>
-        <w:t xml:space="preserve">[6] GStreamer Project. GstPtpClock Documentation.</w:t>
+        <w:t xml:space="preserve">[6] LinuxPTP Project. ptp4l Documentation. Available:</w:t>
       </w:r>
       <w:r>
         <w:t xml:space="preserve"> </w:t>
       </w:r>
-      <w:hyperlink r:id="rId51">
+      <w:hyperlink r:id="rId56">
+        <w:r>
+          <w:rPr>
+            <w:rStyle w:val="Hyperlink"/>
+          </w:rPr>
+          <w:t xml:space="preserve">https://www.linuxptp.org/documentation/ptp4l/</w:t>
+        </w:r>
+      </w:hyperlink>
+      <w:r>
+        <w:t xml:space="preserve">.</w:t>
+      </w:r>
+    </w:p>
+    <w:p>
+      <w:pPr>
+        <w:pStyle w:val="BodyText"/>
+      </w:pPr>
+      <w:r>
+        <w:t xml:space="preserve">[7] LinuxPTP Project. phc2sys Documentation. Available:</w:t>
+      </w:r>
+      <w:r>
+        <w:t xml:space="preserve"> </w:t>
+      </w:r>
+      <w:hyperlink r:id="rId57">
+        <w:r>
+          <w:rPr>
+            <w:rStyle w:val="Hyperlink"/>
+          </w:rPr>
+          <w:t xml:space="preserve">https://www.linuxptp.org/documentation/phc2sys/</w:t>
+        </w:r>
+      </w:hyperlink>
+      <w:r>
+        <w:t xml:space="preserve">.</w:t>
+      </w:r>
+    </w:p>
+    <w:p>
+      <w:pPr>
+        <w:pStyle w:val="BodyText"/>
+      </w:pPr>
+      <w:r>
+        <w:t xml:space="preserve">[8] GStreamer Project. GstPtpClock Documentation. Available:</w:t>
+      </w:r>
+      <w:r>
+        <w:t xml:space="preserve"> </w:t>
+      </w:r>
+      <w:hyperlink r:id="rId58">
         <w:r>
           <w:rPr>
             <w:rStyle w:val="Hyperlink"/>
@@ -1402,7 +2319,7 @@
         </w:r>
       </w:hyperlink>
       <w:r>
-        <w:t xml:space="preserve">; 2026 [accessed 10 May 2026].</w:t>
+        <w:t xml:space="preserve">.</w:t>
       </w:r>
     </w:p>
     <w:p>
@@ -1410,21 +2327,21 @@
         <w:pStyle w:val="BodyText"/>
       </w:pPr>
       <w:r>
-        <w:t xml:space="preserve">[7] JSON Schema. JSON Schema Core and Validation Specifications.</w:t>
+        <w:t xml:space="preserve">[9] JSON Schema. JSON Schema: A Media Type for Describing JSON Documents. Draft 2020-12. Available:</w:t>
       </w:r>
       <w:r>
         <w:t xml:space="preserve"> </w:t>
       </w:r>
-      <w:hyperlink r:id="rId52">
+      <w:hyperlink r:id="rId59">
         <w:r>
           <w:rPr>
             <w:rStyle w:val="Hyperlink"/>
           </w:rPr>
-          <w:t xml:space="preserve">https://json-schema.org/specification</w:t>
+          <w:t xml:space="preserve">https://json-schema.org/draft/2020-12/json-schema-core.html</w:t>
         </w:r>
       </w:hyperlink>
       <w:r>
-        <w:t xml:space="preserve">; 2026 [accessed 10 May 2026].</w:t>
+        <w:t xml:space="preserve">.</w:t>
       </w:r>
     </w:p>
     <w:p>
@@ -1432,12 +2349,34 @@
         <w:pStyle w:val="BodyText"/>
       </w:pPr>
       <w:r>
-        <w:t xml:space="preserve">[8] Association for Computing Machinery. Artifact Review and Badging.</w:t>
+        <w:t xml:space="preserve">[10] JSON Schema. JSON Schema Validation: A Vocabulary for Structural Validation of JSON. Draft 2020-12. Available:</w:t>
       </w:r>
       <w:r>
         <w:t xml:space="preserve"> </w:t>
       </w:r>
-      <w:hyperlink r:id="rId53">
+      <w:hyperlink r:id="rId60">
+        <w:r>
+          <w:rPr>
+            <w:rStyle w:val="Hyperlink"/>
+          </w:rPr>
+          <w:t xml:space="preserve">https://json-schema.org/draft/2020-12/json-schema-validation.html</w:t>
+        </w:r>
+      </w:hyperlink>
+      <w:r>
+        <w:t xml:space="preserve">.</w:t>
+      </w:r>
+    </w:p>
+    <w:p>
+      <w:pPr>
+        <w:pStyle w:val="BodyText"/>
+      </w:pPr>
+      <w:r>
+        <w:t xml:space="preserve">[11] Association for Computing Machinery. Artifact Review and Badging - Current. Version 1.1; 2020. Available:</w:t>
+      </w:r>
+      <w:r>
+        <w:t xml:space="preserve"> </w:t>
+      </w:r>
+      <w:hyperlink r:id="rId61">
         <w:r>
           <w:rPr>
             <w:rStyle w:val="Hyperlink"/>
@@ -1446,7 +2385,7 @@
         </w:r>
       </w:hyperlink>
       <w:r>
-        <w:t xml:space="preserve">; 2026 [accessed 10 May 2026].</w:t>
+        <w:t xml:space="preserve">.</w:t>
       </w:r>
     </w:p>
     <w:p>
@@ -1454,17 +2393,17 @@
         <w:pStyle w:val="BodyText"/>
       </w:pPr>
       <w:r>
-        <w:t xml:space="preserve">[9] Zhang B. AEP-Media v0.1.0: Offline Validation of Time-Aware Media Evidence Bundles [software]. Zenodo; 2026.</w:t>
+        <w:t xml:space="preserve">[12] Torres-Arias S, Afzali H, Kuppusamy TK, Curtmola R, Cappos J. in-toto: Providing farm-to-table guarantees for bits and bytes. USENIX Security Symposium; 2019. Available:</w:t>
       </w:r>
       <w:r>
         <w:t xml:space="preserve"> </w:t>
       </w:r>
-      <w:hyperlink r:id="rId54">
+      <w:hyperlink r:id="rId62">
         <w:r>
           <w:rPr>
             <w:rStyle w:val="Hyperlink"/>
           </w:rPr>
-          <w:t xml:space="preserve">https://doi.org/10.5281/zenodo.20107097</w:t>
+          <w:t xml:space="preserve">https://www.usenix.org/conference/usenixsecurity19/presentation/torres-arias</w:t>
         </w:r>
       </w:hyperlink>
       <w:r>
@@ -1476,21 +2415,21 @@
         <w:pStyle w:val="BodyText"/>
       </w:pPr>
       <w:r>
-        <w:t xml:space="preserve">[10] in-toto Project. in-toto: Providing farm-to-table guarantees for bits and bytes.</w:t>
+        <w:t xml:space="preserve">[13] SLSA Community. SLSA Provenance. Available:</w:t>
       </w:r>
       <w:r>
         <w:t xml:space="preserve"> </w:t>
       </w:r>
-      <w:hyperlink r:id="rId55">
+      <w:hyperlink r:id="rId63">
         <w:r>
           <w:rPr>
             <w:rStyle w:val="Hyperlink"/>
           </w:rPr>
-          <w:t xml:space="preserve">https://in-toto.io/</w:t>
+          <w:t xml:space="preserve">https://slsa.dev/provenance</w:t>
         </w:r>
       </w:hyperlink>
       <w:r>
-        <w:t xml:space="preserve">; 2026 [accessed 10 May 2026].</w:t>
+        <w:t xml:space="preserve">.</w:t>
       </w:r>
     </w:p>
     <w:p>
@@ -1498,25 +2437,33 @@
         <w:pStyle w:val="BodyText"/>
       </w:pPr>
       <w:r>
-        <w:t xml:space="preserve">[11] Supply-chain Levels for Software Artifacts. SLSA Provenance.</w:t>
+        <w:t xml:space="preserve">[14] Kahn R, Wilensky R. A framework for distributed digital object services. International Journal on Digital Libraries. 2006;6:115-123. doi:10.1007/s00799-005-0128-x.</w:t>
+      </w:r>
+    </w:p>
+    <w:p>
+      <w:pPr>
+        <w:pStyle w:val="BodyText"/>
+      </w:pPr>
+      <w:r>
+        <w:t xml:space="preserve">[15] DONA Foundation. Digital Object Interface Protocol Specification, version 2.0; 2018. Available:</w:t>
       </w:r>
       <w:r>
         <w:t xml:space="preserve"> </w:t>
       </w:r>
-      <w:hyperlink r:id="rId56">
+      <w:hyperlink r:id="rId64">
         <w:r>
           <w:rPr>
             <w:rStyle w:val="Hyperlink"/>
           </w:rPr>
-          <w:t xml:space="preserve">https://slsa.dev/spec/v1.0/provenance</w:t>
+          <w:t xml:space="preserve">https://www.dona.net/sites/default/files/2018-11/DOIPv2Spec_1.pdf</w:t>
         </w:r>
       </w:hyperlink>
       <w:r>
-        <w:t xml:space="preserve">; 2026 [accessed 10 May 2026].</w:t>
-      </w:r>
-    </w:p>
-    <w:bookmarkEnd w:id="57"/>
-    <w:bookmarkEnd w:id="58"/>
+        <w:t xml:space="preserve">.</w:t>
+      </w:r>
+    </w:p>
+    <w:bookmarkEnd w:id="65"/>
+    <w:bookmarkEnd w:id="66"/>
     <w:sectPr>
       <w:headerReference r:id="rId18" w:type="even"/>
       <w:headerReference r:id="rId19" w:type="default"/>
@@ -3824,6 +4771,9 @@
     <w:abstractNumId w:val="990"/>
   </w:num>
   <w:num w:numId="1001">
+    <w:abstractNumId w:val="991"/>
+  </w:num>
+  <w:num w:numId="1002">
     <w:abstractNumId w:val="991"/>
   </w:num>
 </w:numbering>

</xml_diff>

<commit_message>
Freeze authoritative AEP-Media SoftwareX upload package
</commit_message>
<xml_diff>
--- a/docs/paper/softwarex/final/submission-pack/main/AEP-Media_SoftwareX_Manuscript.docx
+++ b/docs/paper/softwarex/final/submission-pack/main/AEP-Media_SoftwareX_Manuscript.docx
@@ -33,7 +33,7 @@
         <w:pStyle w:val="BodyText"/>
       </w:pPr>
       <w:r>
-        <w:t xml:space="preserve">Independent Researcher</w:t>
+        <w:t xml:space="preserve">Independent Researcher, China</w:t>
       </w:r>
     </w:p>
     <w:p>
@@ -50,6 +50,14 @@
       </w:pPr>
       <w:r>
         <w:t xml:space="preserve">Email: joy7759@gmail.com</w:t>
+      </w:r>
+    </w:p>
+    <w:p>
+      <w:pPr>
+        <w:pStyle w:val="BodyText"/>
+      </w:pPr>
+      <w:r>
+        <w:t xml:space="preserve">Corresponding author: Bin Zhang (joy7759@gmail.com)</w:t>
       </w:r>
     </w:p>
     <w:bookmarkEnd w:id="32"/>
@@ -290,7 +298,16 @@
         </w:numPr>
       </w:pPr>
       <w:r>
-        <w:t xml:space="preserve">Operating system: platform-independent Python package; validated in the repository test environment described in the release reports.</w:t>
+        <w:t xml:space="preserve">Installation:</w:t>
+      </w:r>
+      <w:r>
+        <w:t xml:space="preserve"> </w:t>
+      </w:r>
+      <w:r>
+        <w:rPr>
+          <w:rStyle w:val="VerbatimChar"/>
+        </w:rPr>
+        <w:t xml:space="preserve">python -m pip install -e .</w:t>
       </w:r>
     </w:p>
     <w:p>
@@ -302,91 +319,7 @@
         </w:numPr>
       </w:pPr>
       <w:r>
-        <w:t xml:space="preserve">Documentation:</w:t>
-      </w:r>
-      <w:r>
-        <w:t xml:space="preserve"> </w:t>
-      </w:r>
-      <w:r>
-        <w:rPr>
-          <w:rStyle w:val="VerbatimChar"/>
-        </w:rPr>
-        <w:t xml:space="preserve">README.md</w:t>
-      </w:r>
-      <w:r>
-        <w:t xml:space="preserve">,</w:t>
-      </w:r>
-      <w:r>
-        <w:t xml:space="preserve"> </w:t>
-      </w:r>
-      <w:r>
-        <w:rPr>
-          <w:rStyle w:val="VerbatimChar"/>
-        </w:rPr>
-        <w:t xml:space="preserve">spec/</w:t>
-      </w:r>
-      <w:r>
-        <w:t xml:space="preserve">,</w:t>
-      </w:r>
-      <w:r>
-        <w:t xml:space="preserve"> </w:t>
-      </w:r>
-      <w:r>
-        <w:rPr>
-          <w:rStyle w:val="VerbatimChar"/>
-        </w:rPr>
-        <w:t xml:space="preserve">schema/</w:t>
-      </w:r>
-      <w:r>
-        <w:t xml:space="preserve">,</w:t>
-      </w:r>
-      <w:r>
-        <w:t xml:space="preserve"> </w:t>
-      </w:r>
-      <w:r>
-        <w:rPr>
-          <w:rStyle w:val="VerbatimChar"/>
-        </w:rPr>
-        <w:t xml:space="preserve">examples/media/</w:t>
-      </w:r>
-      <w:r>
-        <w:t xml:space="preserve">,</w:t>
-      </w:r>
-      <w:r>
-        <w:t xml:space="preserve"> </w:t>
-      </w:r>
-      <w:r>
-        <w:rPr>
-          <w:rStyle w:val="VerbatimChar"/>
-        </w:rPr>
-        <w:t xml:space="preserve">demo/</w:t>
-      </w:r>
-      <w:r>
-        <w:t xml:space="preserve">,</w:t>
-      </w:r>
-      <w:r>
-        <w:t xml:space="preserve"> </w:t>
-      </w:r>
-      <w:r>
-        <w:rPr>
-          <w:rStyle w:val="VerbatimChar"/>
-        </w:rPr>
-        <w:t xml:space="preserve">docs/reports/</w:t>
-      </w:r>
-      <w:r>
-        <w:t xml:space="preserve">, and</w:t>
-      </w:r>
-      <w:r>
-        <w:t xml:space="preserve"> </w:t>
-      </w:r>
-      <w:r>
-        <w:rPr>
-          <w:rStyle w:val="VerbatimChar"/>
-        </w:rPr>
-        <w:t xml:space="preserve">docs/paper/softwarex/</w:t>
-      </w:r>
-      <w:r>
-        <w:t xml:space="preserve">.</w:t>
+        <w:t xml:space="preserve">Operating system: platform-independent Python package; validated in the repository test environment described in the release reports.</w:t>
       </w:r>
     </w:p>
     <w:p>
@@ -398,7 +331,7 @@
         </w:numPr>
       </w:pPr>
       <w:r>
-        <w:t xml:space="preserve">Tests:</w:t>
+        <w:t xml:space="preserve">Documentation:</w:t>
       </w:r>
       <w:r>
         <w:t xml:space="preserve"> </w:t>
@@ -407,13 +340,82 @@
         <w:rPr>
           <w:rStyle w:val="VerbatimChar"/>
         </w:rPr>
-        <w:t xml:space="preserve">tests/test_media_*.py</w:t>
+        <w:t xml:space="preserve">README.md</w:t>
+      </w:r>
+      <w:r>
+        <w:t xml:space="preserve">,</w:t>
       </w:r>
       <w:r>
         <w:t xml:space="preserve"> </w:t>
       </w:r>
       <w:r>
-        <w:t xml:space="preserve">and related readiness tests.</w:t>
+        <w:rPr>
+          <w:rStyle w:val="VerbatimChar"/>
+        </w:rPr>
+        <w:t xml:space="preserve">spec/</w:t>
+      </w:r>
+      <w:r>
+        <w:t xml:space="preserve">,</w:t>
+      </w:r>
+      <w:r>
+        <w:t xml:space="preserve"> </w:t>
+      </w:r>
+      <w:r>
+        <w:rPr>
+          <w:rStyle w:val="VerbatimChar"/>
+        </w:rPr>
+        <w:t xml:space="preserve">schema/</w:t>
+      </w:r>
+      <w:r>
+        <w:t xml:space="preserve">,</w:t>
+      </w:r>
+      <w:r>
+        <w:t xml:space="preserve"> </w:t>
+      </w:r>
+      <w:r>
+        <w:rPr>
+          <w:rStyle w:val="VerbatimChar"/>
+        </w:rPr>
+        <w:t xml:space="preserve">examples/media/</w:t>
+      </w:r>
+      <w:r>
+        <w:t xml:space="preserve">,</w:t>
+      </w:r>
+      <w:r>
+        <w:t xml:space="preserve"> </w:t>
+      </w:r>
+      <w:r>
+        <w:rPr>
+          <w:rStyle w:val="VerbatimChar"/>
+        </w:rPr>
+        <w:t xml:space="preserve">demo/</w:t>
+      </w:r>
+      <w:r>
+        <w:t xml:space="preserve">,</w:t>
+      </w:r>
+      <w:r>
+        <w:t xml:space="preserve"> </w:t>
+      </w:r>
+      <w:r>
+        <w:rPr>
+          <w:rStyle w:val="VerbatimChar"/>
+        </w:rPr>
+        <w:t xml:space="preserve">docs/reports/</w:t>
+      </w:r>
+      <w:r>
+        <w:t xml:space="preserve">, and</w:t>
+      </w:r>
+      <w:r>
+        <w:t xml:space="preserve"> </w:t>
+      </w:r>
+      <w:r>
+        <w:rPr>
+          <w:rStyle w:val="VerbatimChar"/>
+        </w:rPr>
+        <w:t xml:space="preserve">docs/paper/softwarex/</w:t>
+      </w:r>
+      <w:r>
+        <w:t xml:space="preserve">.</w:t>
       </w:r>
     </w:p>
     <w:p>
@@ -425,6 +427,33 @@
         </w:numPr>
       </w:pPr>
       <w:r>
+        <w:t xml:space="preserve">Tests:</w:t>
+      </w:r>
+      <w:r>
+        <w:t xml:space="preserve"> </w:t>
+      </w:r>
+      <w:r>
+        <w:rPr>
+          <w:rStyle w:val="VerbatimChar"/>
+        </w:rPr>
+        <w:t xml:space="preserve">tests/test_media_*.py</w:t>
+      </w:r>
+      <w:r>
+        <w:t xml:space="preserve"> </w:t>
+      </w:r>
+      <w:r>
+        <w:t xml:space="preserve">and related readiness tests.</w:t>
+      </w:r>
+    </w:p>
+    <w:p>
+      <w:pPr>
+        <w:pStyle w:val="Compact"/>
+        <w:numPr>
+          <w:ilvl w:val="0"/>
+          <w:numId w:val="1001"/>
+        </w:numPr>
+      </w:pPr>
+      <w:r>
         <w:t xml:space="preserve">Main commands:</w:t>
       </w:r>
       <w:r>
@@ -495,6 +524,54 @@
           <w:rStyle w:val="VerbatimChar"/>
         </w:rPr>
         <w:t xml:space="preserve">build-aep-media-release-pack</w:t>
+      </w:r>
+      <w:r>
+        <w:t xml:space="preserve">.</w:t>
+      </w:r>
+    </w:p>
+    <w:p>
+      <w:pPr>
+        <w:pStyle w:val="Compact"/>
+        <w:numPr>
+          <w:ilvl w:val="0"/>
+          <w:numId w:val="1001"/>
+        </w:numPr>
+      </w:pPr>
+      <w:r>
+        <w:t xml:space="preserve">Additional ingestion commands:</w:t>
+      </w:r>
+      <w:r>
+        <w:t xml:space="preserve"> </w:t>
+      </w:r>
+      <w:r>
+        <w:rPr>
+          <w:rStyle w:val="VerbatimChar"/>
+        </w:rPr>
+        <w:t xml:space="preserve">ingest-linuxptp-trace</w:t>
+      </w:r>
+      <w:r>
+        <w:t xml:space="preserve">,</w:t>
+      </w:r>
+      <w:r>
+        <w:t xml:space="preserve"> </w:t>
+      </w:r>
+      <w:r>
+        <w:rPr>
+          <w:rStyle w:val="VerbatimChar"/>
+        </w:rPr>
+        <w:t xml:space="preserve">ingest-ffmpeg-prft</w:t>
+      </w:r>
+      <w:r>
+        <w:t xml:space="preserve">, and</w:t>
+      </w:r>
+      <w:r>
+        <w:t xml:space="preserve"> </w:t>
+      </w:r>
+      <w:r>
+        <w:rPr>
+          <w:rStyle w:val="VerbatimChar"/>
+        </w:rPr>
+        <w:t xml:space="preserve">ingest-c2pa-manifest</w:t>
       </w:r>
       <w:r>
         <w:t xml:space="preserve">.</w:t>
@@ -1961,10 +2038,7 @@
         <w:pStyle w:val="BodyText"/>
       </w:pPr>
       <w:r>
-        <w:t xml:space="preserve">The supplementary material,</w:t>
-      </w:r>
-      <w:r>
-        <w:t xml:space="preserve"> </w:t>
+        <w:t xml:space="preserve">Supplementary file S1 (</w:t>
       </w:r>
       <w:r>
         <w:rPr>
@@ -1973,7 +2047,7 @@
         <w:t xml:space="preserve">AEP-Media_SoftwareX_Supplementary.zip</w:t>
       </w:r>
       <w:r>
-        <w:t xml:space="preserve">, contains reproducibility notes, the claim-boundary statement, software inventory, selected schemas, selected examples, evaluation summaries, checksums, and generated reports used to support the release-level validation described in this paper.</w:t>
+        <w:t xml:space="preserve">) contains the supplement README, reproducibility instructions, claim-boundary statement, software inventory, evaluation summary, selected schemas, selected examples, checksums, and release-validation reports used to support the results reported in this paper.</w:t>
       </w:r>
     </w:p>
     <w:bookmarkEnd w:id="42"/>
@@ -2100,6 +2174,14 @@
         <w:t xml:space="preserve">No specific funding was received for this work.</w:t>
       </w:r>
     </w:p>
+    <w:p>
+      <w:pPr>
+        <w:pStyle w:val="BodyText"/>
+      </w:pPr>
+      <w:r>
+        <w:t xml:space="preserve">This work is a software and documentation release; no human participants, animal subjects, or external experimental dataset were used.</w:t>
+      </w:r>
+    </w:p>
     <w:bookmarkEnd w:id="48"/>
     <w:bookmarkStart w:id="49" w:name="data-and-software-availability"/>
     <w:p>
@@ -2133,7 +2215,7 @@
         <w:pStyle w:val="FirstParagraph"/>
       </w:pPr>
       <w:r>
-        <w:t xml:space="preserve">The author used OpenAI ChatGPT/Codex for manuscript organization, implementation scaffolding, command generation, and wording refinement. After using these tools, the author reviewed and edited the content as needed and takes full responsibility for the content of the submitted article.</w:t>
+        <w:t xml:space="preserve">The author used OpenAI ChatGPT/Codex for manuscript organization, command generation, implementation-facing drafting support, and wording refinement. After using these tools, the author reviewed and edited the content as needed and takes full responsibility for the content of the submitted article.</w:t>
       </w:r>
     </w:p>
     <w:bookmarkEnd w:id="50"/>
@@ -2455,7 +2537,7 @@
           <w:rPr>
             <w:rStyle w:val="Hyperlink"/>
           </w:rPr>
-          <w:t xml:space="preserve">https://www.dona.net/sites/default/files/2018-11/DOIPv2Spec_1.pdf</w:t>
+          <w:t xml:space="preserve">https://www.dona.net/doip</w:t>
         </w:r>
       </w:hyperlink>
       <w:r>

</xml_diff>

<commit_message>
chore: close scoped AEP-Media hygiene and benchmark updates
</commit_message>
<xml_diff>
--- a/docs/paper/softwarex/final/submission-pack/main/AEP-Media_SoftwareX_Manuscript.docx
+++ b/docs/paper/softwarex/final/submission-pack/main/AEP-Media_SoftwareX_Manuscript.docx
@@ -2038,16 +2038,7 @@
         <w:pStyle w:val="BodyText"/>
       </w:pPr>
       <w:r>
-        <w:t xml:space="preserve">Supplementary file S1 (</w:t>
-      </w:r>
-      <w:r>
-        <w:rPr>
-          <w:rStyle w:val="VerbatimChar"/>
-        </w:rPr>
-        <w:t xml:space="preserve">AEP-Media_SoftwareX_Supplementary.zip</w:t>
-      </w:r>
-      <w:r>
-        <w:t xml:space="preserve">) contains the supplement README, reproducibility instructions, claim-boundary statement, software inventory, evaluation summary, selected schemas, selected examples, checksums, and release-validation reports used to support the results reported in this paper.</w:t>
+        <w:t xml:space="preserve">Supplementary file S1 contains the supplement README, reproducibility instructions, claim-boundary statement, software inventory, evaluation summary, selected schemas, selected examples, checksums, and release-validation report pointers used to support the results reported in this paper. The machine-readable release materials are available through the GitHub release and Zenodo archive.</w:t>
       </w:r>
     </w:p>
     <w:bookmarkEnd w:id="42"/>

</xml_diff>